<commit_message>
docs: align final requirements and design with implementation
</commit_message>
<xml_diff>
--- a/项目文档/Steam-数字游戏平台系统需求分析文档.docx
+++ b/项目文档/Steam-数字游戏平台系统需求分析文档.docx
@@ -840,73 +840,103 @@
     <w:p>
       <w:pPr>
         <w:pStyle w:val="27"/>
+        <w:keepNext w:val="0"/>
         <w:tabs>
           <w:tab w:val="right" w:leader="dot" w:pos="9355"/>
         </w:tabs>
+        <w:spacing w:after="0" w:line="240" w:lineRule="auto"/>
+        <w:rPr>
+          <w:sz w:val="19"/>
+        </w:rPr>
       </w:pPr>
       <w:r>
         <w:rPr>
           <w:rFonts w:ascii="Times New Roman" w:hAnsi="Times New Roman" w:eastAsia="宋体"/>
-          <w:sz w:val="21"/>
+          <w:sz w:val="19"/>
         </w:rPr>
         <w:fldChar w:fldCharType="begin"/>
       </w:r>
       <w:r>
         <w:rPr>
           <w:rFonts w:ascii="Times New Roman" w:hAnsi="Times New Roman" w:eastAsia="宋体"/>
-          <w:sz w:val="21"/>
+          <w:sz w:val="19"/>
         </w:rPr>
         <w:instrText xml:space="preserve">TOC \o "1-3" \h \z \u</w:instrText>
       </w:r>
       <w:r>
         <w:rPr>
           <w:rFonts w:ascii="Times New Roman" w:hAnsi="Times New Roman" w:eastAsia="宋体"/>
-          <w:sz w:val="21"/>
+          <w:sz w:val="19"/>
         </w:rPr>
         <w:fldChar w:fldCharType="separate"/>
       </w:r>
       <w:r>
         <w:rPr>
           <w:rFonts w:ascii="Times New Roman" w:hAnsi="Times New Roman" w:eastAsia="宋体"/>
+          <w:sz w:val="19"/>
         </w:rPr>
         <w:fldChar w:fldCharType="begin"/>
       </w:r>
       <w:r>
         <w:rPr>
           <w:rFonts w:ascii="Times New Roman" w:hAnsi="Times New Roman" w:eastAsia="宋体"/>
-        </w:rPr>
-        <w:instrText xml:space="preserve"> HYPERLINK \l _Toc27092 </w:instrText>
+          <w:sz w:val="19"/>
+        </w:rPr>
+        <w:instrText xml:space="preserve"> HYPERLINK \l _Toc2507 </w:instrText>
       </w:r>
       <w:r>
         <w:rPr>
           <w:rFonts w:ascii="Times New Roman" w:hAnsi="Times New Roman" w:eastAsia="宋体"/>
+          <w:sz w:val="19"/>
         </w:rPr>
         <w:fldChar w:fldCharType="separate"/>
       </w:r>
       <w:r>
+        <w:rPr>
+          <w:sz w:val="19"/>
+        </w:rPr>
         <w:t>1  系统需求概述</w:t>
       </w:r>
       <w:r>
+        <w:rPr>
+          <w:sz w:val="19"/>
+        </w:rPr>
         <w:tab/>
       </w:r>
       <w:r>
+        <w:rPr>
+          <w:sz w:val="19"/>
+        </w:rPr>
         <w:fldChar w:fldCharType="begin"/>
       </w:r>
       <w:r>
-        <w:instrText xml:space="preserve"> PAGEREF _Toc27092 \h </w:instrText>
-      </w:r>
-      <w:r>
+        <w:rPr>
+          <w:sz w:val="19"/>
+        </w:rPr>
+        <w:instrText xml:space="preserve"> PAGEREF _Toc2507 \h </w:instrText>
+      </w:r>
+      <w:r>
+        <w:rPr>
+          <w:sz w:val="19"/>
+        </w:rPr>
         <w:fldChar w:fldCharType="separate"/>
       </w:r>
       <w:r>
+        <w:rPr>
+          <w:sz w:val="19"/>
+        </w:rPr>
         <w:t>1</w:t>
       </w:r>
       <w:r>
+        <w:rPr>
+          <w:sz w:val="19"/>
+        </w:rPr>
         <w:fldChar w:fldCharType="end"/>
       </w:r>
       <w:r>
         <w:rPr>
           <w:rFonts w:ascii="Times New Roman" w:hAnsi="Times New Roman" w:eastAsia="宋体"/>
+          <w:sz w:val="19"/>
         </w:rPr>
         <w:fldChar w:fldCharType="end"/>
       </w:r>
@@ -914,52 +944,82 @@
     <w:p>
       <w:pPr>
         <w:pStyle w:val="30"/>
+        <w:keepNext w:val="0"/>
         <w:tabs>
           <w:tab w:val="right" w:leader="dot" w:pos="9355"/>
         </w:tabs>
+        <w:spacing w:after="0" w:line="240" w:lineRule="auto"/>
+        <w:rPr>
+          <w:sz w:val="19"/>
+        </w:rPr>
       </w:pPr>
       <w:r>
         <w:rPr>
           <w:rFonts w:ascii="Times New Roman" w:hAnsi="Times New Roman" w:eastAsia="宋体"/>
+          <w:sz w:val="19"/>
         </w:rPr>
         <w:fldChar w:fldCharType="begin"/>
       </w:r>
       <w:r>
         <w:rPr>
           <w:rFonts w:ascii="Times New Roman" w:hAnsi="Times New Roman" w:eastAsia="宋体"/>
-        </w:rPr>
-        <w:instrText xml:space="preserve"> HYPERLINK \l _Toc6002 </w:instrText>
+          <w:sz w:val="19"/>
+        </w:rPr>
+        <w:instrText xml:space="preserve"> HYPERLINK \l _Toc16683 </w:instrText>
       </w:r>
       <w:r>
         <w:rPr>
           <w:rFonts w:ascii="Times New Roman" w:hAnsi="Times New Roman" w:eastAsia="宋体"/>
+          <w:sz w:val="19"/>
         </w:rPr>
         <w:fldChar w:fldCharType="separate"/>
       </w:r>
       <w:r>
+        <w:rPr>
+          <w:sz w:val="19"/>
+        </w:rPr>
         <w:t>1.1  项目背景</w:t>
       </w:r>
       <w:r>
+        <w:rPr>
+          <w:sz w:val="19"/>
+        </w:rPr>
         <w:tab/>
       </w:r>
       <w:r>
+        <w:rPr>
+          <w:sz w:val="19"/>
+        </w:rPr>
         <w:fldChar w:fldCharType="begin"/>
       </w:r>
       <w:r>
-        <w:instrText xml:space="preserve"> PAGEREF _Toc6002 \h </w:instrText>
-      </w:r>
-      <w:r>
+        <w:rPr>
+          <w:sz w:val="19"/>
+        </w:rPr>
+        <w:instrText xml:space="preserve"> PAGEREF _Toc16683 \h </w:instrText>
+      </w:r>
+      <w:r>
+        <w:rPr>
+          <w:sz w:val="19"/>
+        </w:rPr>
         <w:fldChar w:fldCharType="separate"/>
       </w:r>
       <w:r>
+        <w:rPr>
+          <w:sz w:val="19"/>
+        </w:rPr>
         <w:t>1</w:t>
       </w:r>
       <w:r>
+        <w:rPr>
+          <w:sz w:val="19"/>
+        </w:rPr>
         <w:fldChar w:fldCharType="end"/>
       </w:r>
       <w:r>
         <w:rPr>
           <w:rFonts w:ascii="Times New Roman" w:hAnsi="Times New Roman" w:eastAsia="宋体"/>
+          <w:sz w:val="19"/>
         </w:rPr>
         <w:fldChar w:fldCharType="end"/>
       </w:r>
@@ -967,52 +1027,82 @@
     <w:p>
       <w:pPr>
         <w:pStyle w:val="30"/>
+        <w:keepNext w:val="0"/>
         <w:tabs>
           <w:tab w:val="right" w:leader="dot" w:pos="9355"/>
         </w:tabs>
+        <w:spacing w:after="0" w:line="240" w:lineRule="auto"/>
+        <w:rPr>
+          <w:sz w:val="19"/>
+        </w:rPr>
       </w:pPr>
       <w:r>
         <w:rPr>
           <w:rFonts w:ascii="Times New Roman" w:hAnsi="Times New Roman" w:eastAsia="宋体"/>
+          <w:sz w:val="19"/>
         </w:rPr>
         <w:fldChar w:fldCharType="begin"/>
       </w:r>
       <w:r>
         <w:rPr>
           <w:rFonts w:ascii="Times New Roman" w:hAnsi="Times New Roman" w:eastAsia="宋体"/>
-        </w:rPr>
-        <w:instrText xml:space="preserve"> HYPERLINK \l _Toc5829 </w:instrText>
+          <w:sz w:val="19"/>
+        </w:rPr>
+        <w:instrText xml:space="preserve"> HYPERLINK \l _Toc22556 </w:instrText>
       </w:r>
       <w:r>
         <w:rPr>
           <w:rFonts w:ascii="Times New Roman" w:hAnsi="Times New Roman" w:eastAsia="宋体"/>
+          <w:sz w:val="19"/>
         </w:rPr>
         <w:fldChar w:fldCharType="separate"/>
       </w:r>
       <w:r>
+        <w:rPr>
+          <w:sz w:val="19"/>
+        </w:rPr>
         <w:t>1.2  建设目标</w:t>
       </w:r>
       <w:r>
+        <w:rPr>
+          <w:sz w:val="19"/>
+        </w:rPr>
         <w:tab/>
       </w:r>
       <w:r>
+        <w:rPr>
+          <w:sz w:val="19"/>
+        </w:rPr>
         <w:fldChar w:fldCharType="begin"/>
       </w:r>
       <w:r>
-        <w:instrText xml:space="preserve"> PAGEREF _Toc5829 \h </w:instrText>
-      </w:r>
-      <w:r>
+        <w:rPr>
+          <w:sz w:val="19"/>
+        </w:rPr>
+        <w:instrText xml:space="preserve"> PAGEREF _Toc22556 \h </w:instrText>
+      </w:r>
+      <w:r>
+        <w:rPr>
+          <w:sz w:val="19"/>
+        </w:rPr>
         <w:fldChar w:fldCharType="separate"/>
       </w:r>
       <w:r>
+        <w:rPr>
+          <w:sz w:val="19"/>
+        </w:rPr>
         <w:t>1</w:t>
       </w:r>
       <w:r>
+        <w:rPr>
+          <w:sz w:val="19"/>
+        </w:rPr>
         <w:fldChar w:fldCharType="end"/>
       </w:r>
       <w:r>
         <w:rPr>
           <w:rFonts w:ascii="Times New Roman" w:hAnsi="Times New Roman" w:eastAsia="宋体"/>
+          <w:sz w:val="19"/>
         </w:rPr>
         <w:fldChar w:fldCharType="end"/>
       </w:r>
@@ -1020,52 +1110,82 @@
     <w:p>
       <w:pPr>
         <w:pStyle w:val="30"/>
+        <w:keepNext w:val="0"/>
         <w:tabs>
           <w:tab w:val="right" w:leader="dot" w:pos="9355"/>
         </w:tabs>
+        <w:spacing w:after="0" w:line="240" w:lineRule="auto"/>
+        <w:rPr>
+          <w:sz w:val="19"/>
+        </w:rPr>
       </w:pPr>
       <w:r>
         <w:rPr>
           <w:rFonts w:ascii="Times New Roman" w:hAnsi="Times New Roman" w:eastAsia="宋体"/>
+          <w:sz w:val="19"/>
         </w:rPr>
         <w:fldChar w:fldCharType="begin"/>
       </w:r>
       <w:r>
         <w:rPr>
           <w:rFonts w:ascii="Times New Roman" w:hAnsi="Times New Roman" w:eastAsia="宋体"/>
-        </w:rPr>
-        <w:instrText xml:space="preserve"> HYPERLINK \l _Toc30452 </w:instrText>
+          <w:sz w:val="19"/>
+        </w:rPr>
+        <w:instrText xml:space="preserve"> HYPERLINK \l _Toc25929 </w:instrText>
       </w:r>
       <w:r>
         <w:rPr>
           <w:rFonts w:ascii="Times New Roman" w:hAnsi="Times New Roman" w:eastAsia="宋体"/>
+          <w:sz w:val="19"/>
         </w:rPr>
         <w:fldChar w:fldCharType="separate"/>
       </w:r>
       <w:r>
+        <w:rPr>
+          <w:sz w:val="19"/>
+        </w:rPr>
         <w:t>1.3  系统范围与边界</w:t>
       </w:r>
       <w:r>
+        <w:rPr>
+          <w:sz w:val="19"/>
+        </w:rPr>
         <w:tab/>
       </w:r>
       <w:r>
+        <w:rPr>
+          <w:sz w:val="19"/>
+        </w:rPr>
         <w:fldChar w:fldCharType="begin"/>
       </w:r>
       <w:r>
-        <w:instrText xml:space="preserve"> PAGEREF _Toc30452 \h </w:instrText>
-      </w:r>
-      <w:r>
+        <w:rPr>
+          <w:sz w:val="19"/>
+        </w:rPr>
+        <w:instrText xml:space="preserve"> PAGEREF _Toc25929 \h </w:instrText>
+      </w:r>
+      <w:r>
+        <w:rPr>
+          <w:sz w:val="19"/>
+        </w:rPr>
         <w:fldChar w:fldCharType="separate"/>
       </w:r>
       <w:r>
+        <w:rPr>
+          <w:sz w:val="19"/>
+        </w:rPr>
         <w:t>2</w:t>
       </w:r>
       <w:r>
+        <w:rPr>
+          <w:sz w:val="19"/>
+        </w:rPr>
         <w:fldChar w:fldCharType="end"/>
       </w:r>
       <w:r>
         <w:rPr>
           <w:rFonts w:ascii="Times New Roman" w:hAnsi="Times New Roman" w:eastAsia="宋体"/>
+          <w:sz w:val="19"/>
         </w:rPr>
         <w:fldChar w:fldCharType="end"/>
       </w:r>
@@ -1073,52 +1193,82 @@
     <w:p>
       <w:pPr>
         <w:pStyle w:val="30"/>
+        <w:keepNext w:val="0"/>
         <w:tabs>
           <w:tab w:val="right" w:leader="dot" w:pos="9355"/>
         </w:tabs>
+        <w:spacing w:after="0" w:line="240" w:lineRule="auto"/>
+        <w:rPr>
+          <w:sz w:val="19"/>
+        </w:rPr>
       </w:pPr>
       <w:r>
         <w:rPr>
           <w:rFonts w:ascii="Times New Roman" w:hAnsi="Times New Roman" w:eastAsia="宋体"/>
+          <w:sz w:val="19"/>
         </w:rPr>
         <w:fldChar w:fldCharType="begin"/>
       </w:r>
       <w:r>
         <w:rPr>
           <w:rFonts w:ascii="Times New Roman" w:hAnsi="Times New Roman" w:eastAsia="宋体"/>
-        </w:rPr>
-        <w:instrText xml:space="preserve"> HYPERLINK \l _Toc6117 </w:instrText>
+          <w:sz w:val="19"/>
+        </w:rPr>
+        <w:instrText xml:space="preserve"> HYPERLINK \l _Toc27702 </w:instrText>
       </w:r>
       <w:r>
         <w:rPr>
           <w:rFonts w:ascii="Times New Roman" w:hAnsi="Times New Roman" w:eastAsia="宋体"/>
+          <w:sz w:val="19"/>
         </w:rPr>
         <w:fldChar w:fldCharType="separate"/>
       </w:r>
       <w:r>
+        <w:rPr>
+          <w:sz w:val="19"/>
+        </w:rPr>
         <w:t>1.4  用户角色与职责</w:t>
       </w:r>
       <w:r>
+        <w:rPr>
+          <w:sz w:val="19"/>
+        </w:rPr>
         <w:tab/>
       </w:r>
       <w:r>
+        <w:rPr>
+          <w:sz w:val="19"/>
+        </w:rPr>
         <w:fldChar w:fldCharType="begin"/>
       </w:r>
       <w:r>
-        <w:instrText xml:space="preserve"> PAGEREF _Toc6117 \h </w:instrText>
-      </w:r>
-      <w:r>
+        <w:rPr>
+          <w:sz w:val="19"/>
+        </w:rPr>
+        <w:instrText xml:space="preserve"> PAGEREF _Toc27702 \h </w:instrText>
+      </w:r>
+      <w:r>
+        <w:rPr>
+          <w:sz w:val="19"/>
+        </w:rPr>
         <w:fldChar w:fldCharType="separate"/>
       </w:r>
       <w:r>
+        <w:rPr>
+          <w:sz w:val="19"/>
+        </w:rPr>
         <w:t>2</w:t>
       </w:r>
       <w:r>
+        <w:rPr>
+          <w:sz w:val="19"/>
+        </w:rPr>
         <w:fldChar w:fldCharType="end"/>
       </w:r>
       <w:r>
         <w:rPr>
           <w:rFonts w:ascii="Times New Roman" w:hAnsi="Times New Roman" w:eastAsia="宋体"/>
+          <w:sz w:val="19"/>
         </w:rPr>
         <w:fldChar w:fldCharType="end"/>
       </w:r>
@@ -1126,52 +1276,82 @@
     <w:p>
       <w:pPr>
         <w:pStyle w:val="30"/>
+        <w:keepNext w:val="0"/>
         <w:tabs>
           <w:tab w:val="right" w:leader="dot" w:pos="9355"/>
         </w:tabs>
+        <w:spacing w:after="0" w:line="240" w:lineRule="auto"/>
+        <w:rPr>
+          <w:sz w:val="19"/>
+        </w:rPr>
       </w:pPr>
       <w:r>
         <w:rPr>
           <w:rFonts w:ascii="Times New Roman" w:hAnsi="Times New Roman" w:eastAsia="宋体"/>
+          <w:sz w:val="19"/>
         </w:rPr>
         <w:fldChar w:fldCharType="begin"/>
       </w:r>
       <w:r>
         <w:rPr>
           <w:rFonts w:ascii="Times New Roman" w:hAnsi="Times New Roman" w:eastAsia="宋体"/>
-        </w:rPr>
-        <w:instrText xml:space="preserve"> HYPERLINK \l _Toc7370 </w:instrText>
+          <w:sz w:val="19"/>
+        </w:rPr>
+        <w:instrText xml:space="preserve"> HYPERLINK \l _Toc7873 </w:instrText>
       </w:r>
       <w:r>
         <w:rPr>
           <w:rFonts w:ascii="Times New Roman" w:hAnsi="Times New Roman" w:eastAsia="宋体"/>
+          <w:sz w:val="19"/>
         </w:rPr>
         <w:fldChar w:fldCharType="separate"/>
       </w:r>
       <w:r>
+        <w:rPr>
+          <w:sz w:val="19"/>
+        </w:rPr>
         <w:t>1.5  固定演示数据与业务定位</w:t>
       </w:r>
       <w:r>
+        <w:rPr>
+          <w:sz w:val="19"/>
+        </w:rPr>
         <w:tab/>
       </w:r>
       <w:r>
+        <w:rPr>
+          <w:sz w:val="19"/>
+        </w:rPr>
         <w:fldChar w:fldCharType="begin"/>
       </w:r>
       <w:r>
-        <w:instrText xml:space="preserve"> PAGEREF _Toc7370 \h </w:instrText>
-      </w:r>
-      <w:r>
+        <w:rPr>
+          <w:sz w:val="19"/>
+        </w:rPr>
+        <w:instrText xml:space="preserve"> PAGEREF _Toc7873 \h </w:instrText>
+      </w:r>
+      <w:r>
+        <w:rPr>
+          <w:sz w:val="19"/>
+        </w:rPr>
         <w:fldChar w:fldCharType="separate"/>
       </w:r>
       <w:r>
+        <w:rPr>
+          <w:sz w:val="19"/>
+        </w:rPr>
         <w:t>2</w:t>
       </w:r>
       <w:r>
+        <w:rPr>
+          <w:sz w:val="19"/>
+        </w:rPr>
         <w:fldChar w:fldCharType="end"/>
       </w:r>
       <w:r>
         <w:rPr>
           <w:rFonts w:ascii="Times New Roman" w:hAnsi="Times New Roman" w:eastAsia="宋体"/>
+          <w:sz w:val="19"/>
         </w:rPr>
         <w:fldChar w:fldCharType="end"/>
       </w:r>
@@ -1179,52 +1359,82 @@
     <w:p>
       <w:pPr>
         <w:pStyle w:val="30"/>
+        <w:keepNext w:val="0"/>
         <w:tabs>
           <w:tab w:val="right" w:leader="dot" w:pos="9355"/>
         </w:tabs>
+        <w:spacing w:after="0" w:line="240" w:lineRule="auto"/>
+        <w:rPr>
+          <w:sz w:val="19"/>
+        </w:rPr>
       </w:pPr>
       <w:r>
         <w:rPr>
           <w:rFonts w:ascii="Times New Roman" w:hAnsi="Times New Roman" w:eastAsia="宋体"/>
+          <w:sz w:val="19"/>
         </w:rPr>
         <w:fldChar w:fldCharType="begin"/>
       </w:r>
       <w:r>
         <w:rPr>
           <w:rFonts w:ascii="Times New Roman" w:hAnsi="Times New Roman" w:eastAsia="宋体"/>
-        </w:rPr>
-        <w:instrText xml:space="preserve"> HYPERLINK \l _Toc4706 </w:instrText>
+          <w:sz w:val="19"/>
+        </w:rPr>
+        <w:instrText xml:space="preserve"> HYPERLINK \l _Toc31005 </w:instrText>
       </w:r>
       <w:r>
         <w:rPr>
           <w:rFonts w:ascii="Times New Roman" w:hAnsi="Times New Roman" w:eastAsia="宋体"/>
+          <w:sz w:val="19"/>
         </w:rPr>
         <w:fldChar w:fldCharType="separate"/>
       </w:r>
       <w:r>
+        <w:rPr>
+          <w:sz w:val="19"/>
+        </w:rPr>
         <w:t>1.6  技术与运行约束</w:t>
       </w:r>
       <w:r>
+        <w:rPr>
+          <w:sz w:val="19"/>
+        </w:rPr>
         <w:tab/>
       </w:r>
       <w:r>
+        <w:rPr>
+          <w:sz w:val="19"/>
+        </w:rPr>
         <w:fldChar w:fldCharType="begin"/>
       </w:r>
       <w:r>
-        <w:instrText xml:space="preserve"> PAGEREF _Toc4706 \h </w:instrText>
-      </w:r>
-      <w:r>
+        <w:rPr>
+          <w:sz w:val="19"/>
+        </w:rPr>
+        <w:instrText xml:space="preserve"> PAGEREF _Toc31005 \h </w:instrText>
+      </w:r>
+      <w:r>
+        <w:rPr>
+          <w:sz w:val="19"/>
+        </w:rPr>
         <w:fldChar w:fldCharType="separate"/>
       </w:r>
       <w:r>
+        <w:rPr>
+          <w:sz w:val="19"/>
+        </w:rPr>
         <w:t>3</w:t>
       </w:r>
       <w:r>
+        <w:rPr>
+          <w:sz w:val="19"/>
+        </w:rPr>
         <w:fldChar w:fldCharType="end"/>
       </w:r>
       <w:r>
         <w:rPr>
           <w:rFonts w:ascii="Times New Roman" w:hAnsi="Times New Roman" w:eastAsia="宋体"/>
+          <w:sz w:val="19"/>
         </w:rPr>
         <w:fldChar w:fldCharType="end"/>
       </w:r>
@@ -1232,52 +1442,82 @@
     <w:p>
       <w:pPr>
         <w:pStyle w:val="30"/>
+        <w:keepNext w:val="0"/>
         <w:tabs>
           <w:tab w:val="right" w:leader="dot" w:pos="9355"/>
         </w:tabs>
+        <w:spacing w:after="0" w:line="240" w:lineRule="auto"/>
+        <w:rPr>
+          <w:sz w:val="19"/>
+        </w:rPr>
       </w:pPr>
       <w:r>
         <w:rPr>
           <w:rFonts w:ascii="Times New Roman" w:hAnsi="Times New Roman" w:eastAsia="宋体"/>
+          <w:sz w:val="19"/>
         </w:rPr>
         <w:fldChar w:fldCharType="begin"/>
       </w:r>
       <w:r>
         <w:rPr>
           <w:rFonts w:ascii="Times New Roman" w:hAnsi="Times New Roman" w:eastAsia="宋体"/>
-        </w:rPr>
-        <w:instrText xml:space="preserve"> HYPERLINK \l _Toc12915 </w:instrText>
+          <w:sz w:val="19"/>
+        </w:rPr>
+        <w:instrText xml:space="preserve"> HYPERLINK \l _Toc31812 </w:instrText>
       </w:r>
       <w:r>
         <w:rPr>
           <w:rFonts w:ascii="Times New Roman" w:hAnsi="Times New Roman" w:eastAsia="宋体"/>
+          <w:sz w:val="19"/>
         </w:rPr>
         <w:fldChar w:fldCharType="separate"/>
       </w:r>
       <w:r>
+        <w:rPr>
+          <w:sz w:val="19"/>
+        </w:rPr>
         <w:t>1.7  功能演进与架构深化说明</w:t>
       </w:r>
       <w:r>
+        <w:rPr>
+          <w:sz w:val="19"/>
+        </w:rPr>
         <w:tab/>
       </w:r>
       <w:r>
+        <w:rPr>
+          <w:sz w:val="19"/>
+        </w:rPr>
         <w:fldChar w:fldCharType="begin"/>
       </w:r>
       <w:r>
-        <w:instrText xml:space="preserve"> PAGEREF _Toc12915 \h </w:instrText>
-      </w:r>
-      <w:r>
+        <w:rPr>
+          <w:sz w:val="19"/>
+        </w:rPr>
+        <w:instrText xml:space="preserve"> PAGEREF _Toc31812 \h </w:instrText>
+      </w:r>
+      <w:r>
+        <w:rPr>
+          <w:sz w:val="19"/>
+        </w:rPr>
         <w:fldChar w:fldCharType="separate"/>
       </w:r>
       <w:r>
+        <w:rPr>
+          <w:sz w:val="19"/>
+        </w:rPr>
         <w:t>3</w:t>
       </w:r>
       <w:r>
+        <w:rPr>
+          <w:sz w:val="19"/>
+        </w:rPr>
         <w:fldChar w:fldCharType="end"/>
       </w:r>
       <w:r>
         <w:rPr>
           <w:rFonts w:ascii="Times New Roman" w:hAnsi="Times New Roman" w:eastAsia="宋体"/>
+          <w:sz w:val="19"/>
         </w:rPr>
         <w:fldChar w:fldCharType="end"/>
       </w:r>
@@ -1285,52 +1525,82 @@
     <w:p>
       <w:pPr>
         <w:pStyle w:val="27"/>
+        <w:keepNext w:val="0"/>
         <w:tabs>
           <w:tab w:val="right" w:leader="dot" w:pos="9355"/>
         </w:tabs>
+        <w:spacing w:after="0" w:line="240" w:lineRule="auto"/>
+        <w:rPr>
+          <w:sz w:val="19"/>
+        </w:rPr>
       </w:pPr>
       <w:r>
         <w:rPr>
           <w:rFonts w:ascii="Times New Roman" w:hAnsi="Times New Roman" w:eastAsia="宋体"/>
+          <w:sz w:val="19"/>
         </w:rPr>
         <w:fldChar w:fldCharType="begin"/>
       </w:r>
       <w:r>
         <w:rPr>
           <w:rFonts w:ascii="Times New Roman" w:hAnsi="Times New Roman" w:eastAsia="宋体"/>
-        </w:rPr>
-        <w:instrText xml:space="preserve"> HYPERLINK \l _Toc26277 </w:instrText>
+          <w:sz w:val="19"/>
+        </w:rPr>
+        <w:instrText xml:space="preserve"> HYPERLINK \l _Toc17291 </w:instrText>
       </w:r>
       <w:r>
         <w:rPr>
           <w:rFonts w:ascii="Times New Roman" w:hAnsi="Times New Roman" w:eastAsia="宋体"/>
+          <w:sz w:val="19"/>
         </w:rPr>
         <w:fldChar w:fldCharType="separate"/>
       </w:r>
       <w:r>
+        <w:rPr>
+          <w:sz w:val="19"/>
+        </w:rPr>
         <w:t>2  系统需求分析</w:t>
       </w:r>
       <w:r>
+        <w:rPr>
+          <w:sz w:val="19"/>
+        </w:rPr>
         <w:tab/>
       </w:r>
       <w:r>
+        <w:rPr>
+          <w:sz w:val="19"/>
+        </w:rPr>
         <w:fldChar w:fldCharType="begin"/>
       </w:r>
       <w:r>
-        <w:instrText xml:space="preserve"> PAGEREF _Toc26277 \h </w:instrText>
-      </w:r>
-      <w:r>
+        <w:rPr>
+          <w:sz w:val="19"/>
+        </w:rPr>
+        <w:instrText xml:space="preserve"> PAGEREF _Toc17291 \h </w:instrText>
+      </w:r>
+      <w:r>
+        <w:rPr>
+          <w:sz w:val="19"/>
+        </w:rPr>
         <w:fldChar w:fldCharType="separate"/>
       </w:r>
       <w:r>
+        <w:rPr>
+          <w:sz w:val="19"/>
+        </w:rPr>
         <w:t>5</w:t>
       </w:r>
       <w:r>
+        <w:rPr>
+          <w:sz w:val="19"/>
+        </w:rPr>
         <w:fldChar w:fldCharType="end"/>
       </w:r>
       <w:r>
         <w:rPr>
           <w:rFonts w:ascii="Times New Roman" w:hAnsi="Times New Roman" w:eastAsia="宋体"/>
+          <w:sz w:val="19"/>
         </w:rPr>
         <w:fldChar w:fldCharType="end"/>
       </w:r>
@@ -1338,52 +1608,82 @@
     <w:p>
       <w:pPr>
         <w:pStyle w:val="30"/>
+        <w:keepNext w:val="0"/>
         <w:tabs>
           <w:tab w:val="right" w:leader="dot" w:pos="9355"/>
         </w:tabs>
+        <w:spacing w:after="0" w:line="240" w:lineRule="auto"/>
+        <w:rPr>
+          <w:sz w:val="19"/>
+        </w:rPr>
       </w:pPr>
       <w:r>
         <w:rPr>
           <w:rFonts w:ascii="Times New Roman" w:hAnsi="Times New Roman" w:eastAsia="宋体"/>
+          <w:sz w:val="19"/>
         </w:rPr>
         <w:fldChar w:fldCharType="begin"/>
       </w:r>
       <w:r>
         <w:rPr>
           <w:rFonts w:ascii="Times New Roman" w:hAnsi="Times New Roman" w:eastAsia="宋体"/>
-        </w:rPr>
-        <w:instrText xml:space="preserve"> HYPERLINK \l _Toc2063 </w:instrText>
+          <w:sz w:val="19"/>
+        </w:rPr>
+        <w:instrText xml:space="preserve"> HYPERLINK \l _Toc9515 </w:instrText>
       </w:r>
       <w:r>
         <w:rPr>
           <w:rFonts w:ascii="Times New Roman" w:hAnsi="Times New Roman" w:eastAsia="宋体"/>
+          <w:sz w:val="19"/>
         </w:rPr>
         <w:fldChar w:fldCharType="separate"/>
       </w:r>
       <w:r>
+        <w:rPr>
+          <w:sz w:val="19"/>
+        </w:rPr>
         <w:t>2.1  总体业务场景</w:t>
       </w:r>
       <w:r>
+        <w:rPr>
+          <w:sz w:val="19"/>
+        </w:rPr>
         <w:tab/>
       </w:r>
       <w:r>
+        <w:rPr>
+          <w:sz w:val="19"/>
+        </w:rPr>
         <w:fldChar w:fldCharType="begin"/>
       </w:r>
       <w:r>
-        <w:instrText xml:space="preserve"> PAGEREF _Toc2063 \h </w:instrText>
-      </w:r>
-      <w:r>
+        <w:rPr>
+          <w:sz w:val="19"/>
+        </w:rPr>
+        <w:instrText xml:space="preserve"> PAGEREF _Toc9515 \h </w:instrText>
+      </w:r>
+      <w:r>
+        <w:rPr>
+          <w:sz w:val="19"/>
+        </w:rPr>
         <w:fldChar w:fldCharType="separate"/>
       </w:r>
       <w:r>
+        <w:rPr>
+          <w:sz w:val="19"/>
+        </w:rPr>
         <w:t>5</w:t>
       </w:r>
       <w:r>
+        <w:rPr>
+          <w:sz w:val="19"/>
+        </w:rPr>
         <w:fldChar w:fldCharType="end"/>
       </w:r>
       <w:r>
         <w:rPr>
           <w:rFonts w:ascii="Times New Roman" w:hAnsi="Times New Roman" w:eastAsia="宋体"/>
+          <w:sz w:val="19"/>
         </w:rPr>
         <w:fldChar w:fldCharType="end"/>
       </w:r>
@@ -1391,52 +1691,82 @@
     <w:p>
       <w:pPr>
         <w:pStyle w:val="30"/>
+        <w:keepNext w:val="0"/>
         <w:tabs>
           <w:tab w:val="right" w:leader="dot" w:pos="9355"/>
         </w:tabs>
+        <w:spacing w:after="0" w:line="240" w:lineRule="auto"/>
+        <w:rPr>
+          <w:sz w:val="19"/>
+        </w:rPr>
       </w:pPr>
       <w:r>
         <w:rPr>
           <w:rFonts w:ascii="Times New Roman" w:hAnsi="Times New Roman" w:eastAsia="宋体"/>
+          <w:sz w:val="19"/>
         </w:rPr>
         <w:fldChar w:fldCharType="begin"/>
       </w:r>
       <w:r>
         <w:rPr>
           <w:rFonts w:ascii="Times New Roman" w:hAnsi="Times New Roman" w:eastAsia="宋体"/>
-        </w:rPr>
-        <w:instrText xml:space="preserve"> HYPERLINK \l _Toc14400 </w:instrText>
+          <w:sz w:val="19"/>
+        </w:rPr>
+        <w:instrText xml:space="preserve"> HYPERLINK \l _Toc7393 </w:instrText>
       </w:r>
       <w:r>
         <w:rPr>
           <w:rFonts w:ascii="Times New Roman" w:hAnsi="Times New Roman" w:eastAsia="宋体"/>
+          <w:sz w:val="19"/>
         </w:rPr>
         <w:fldChar w:fldCharType="separate"/>
       </w:r>
       <w:r>
+        <w:rPr>
+          <w:sz w:val="19"/>
+        </w:rPr>
         <w:t>2.2  功能需求总表</w:t>
       </w:r>
       <w:r>
+        <w:rPr>
+          <w:sz w:val="19"/>
+        </w:rPr>
         <w:tab/>
       </w:r>
       <w:r>
+        <w:rPr>
+          <w:sz w:val="19"/>
+        </w:rPr>
         <w:fldChar w:fldCharType="begin"/>
       </w:r>
       <w:r>
-        <w:instrText xml:space="preserve"> PAGEREF _Toc14400 \h </w:instrText>
-      </w:r>
-      <w:r>
+        <w:rPr>
+          <w:sz w:val="19"/>
+        </w:rPr>
+        <w:instrText xml:space="preserve"> PAGEREF _Toc7393 \h </w:instrText>
+      </w:r>
+      <w:r>
+        <w:rPr>
+          <w:sz w:val="19"/>
+        </w:rPr>
         <w:fldChar w:fldCharType="separate"/>
       </w:r>
       <w:r>
+        <w:rPr>
+          <w:sz w:val="19"/>
+        </w:rPr>
         <w:t>5</w:t>
       </w:r>
       <w:r>
+        <w:rPr>
+          <w:sz w:val="19"/>
+        </w:rPr>
         <w:fldChar w:fldCharType="end"/>
       </w:r>
       <w:r>
         <w:rPr>
           <w:rFonts w:ascii="Times New Roman" w:hAnsi="Times New Roman" w:eastAsia="宋体"/>
+          <w:sz w:val="19"/>
         </w:rPr>
         <w:fldChar w:fldCharType="end"/>
       </w:r>
@@ -1444,52 +1774,82 @@
     <w:p>
       <w:pPr>
         <w:pStyle w:val="30"/>
+        <w:keepNext w:val="0"/>
         <w:tabs>
           <w:tab w:val="right" w:leader="dot" w:pos="9355"/>
         </w:tabs>
+        <w:spacing w:after="0" w:line="240" w:lineRule="auto"/>
+        <w:rPr>
+          <w:sz w:val="19"/>
+        </w:rPr>
       </w:pPr>
       <w:r>
         <w:rPr>
           <w:rFonts w:ascii="Times New Roman" w:hAnsi="Times New Roman" w:eastAsia="宋体"/>
+          <w:sz w:val="19"/>
         </w:rPr>
         <w:fldChar w:fldCharType="begin"/>
       </w:r>
       <w:r>
         <w:rPr>
           <w:rFonts w:ascii="Times New Roman" w:hAnsi="Times New Roman" w:eastAsia="宋体"/>
-        </w:rPr>
-        <w:instrText xml:space="preserve"> HYPERLINK \l _Toc16149 </w:instrText>
+          <w:sz w:val="19"/>
+        </w:rPr>
+        <w:instrText xml:space="preserve"> HYPERLINK \l _Toc22321 </w:instrText>
       </w:r>
       <w:r>
         <w:rPr>
           <w:rFonts w:ascii="Times New Roman" w:hAnsi="Times New Roman" w:eastAsia="宋体"/>
+          <w:sz w:val="19"/>
         </w:rPr>
         <w:fldChar w:fldCharType="separate"/>
       </w:r>
       <w:r>
+        <w:rPr>
+          <w:sz w:val="19"/>
+        </w:rPr>
         <w:t>2.3  玩家端需求</w:t>
       </w:r>
       <w:r>
+        <w:rPr>
+          <w:sz w:val="19"/>
+        </w:rPr>
         <w:tab/>
       </w:r>
       <w:r>
+        <w:rPr>
+          <w:sz w:val="19"/>
+        </w:rPr>
         <w:fldChar w:fldCharType="begin"/>
       </w:r>
       <w:r>
-        <w:instrText xml:space="preserve"> PAGEREF _Toc16149 \h </w:instrText>
-      </w:r>
-      <w:r>
+        <w:rPr>
+          <w:sz w:val="19"/>
+        </w:rPr>
+        <w:instrText xml:space="preserve"> PAGEREF _Toc22321 \h </w:instrText>
+      </w:r>
+      <w:r>
+        <w:rPr>
+          <w:sz w:val="19"/>
+        </w:rPr>
         <w:fldChar w:fldCharType="separate"/>
       </w:r>
       <w:r>
+        <w:rPr>
+          <w:sz w:val="19"/>
+        </w:rPr>
         <w:t>7</w:t>
       </w:r>
       <w:r>
+        <w:rPr>
+          <w:sz w:val="19"/>
+        </w:rPr>
         <w:fldChar w:fldCharType="end"/>
       </w:r>
       <w:r>
         <w:rPr>
           <w:rFonts w:ascii="Times New Roman" w:hAnsi="Times New Roman" w:eastAsia="宋体"/>
+          <w:sz w:val="19"/>
         </w:rPr>
         <w:fldChar w:fldCharType="end"/>
       </w:r>
@@ -1497,52 +1857,82 @@
     <w:p>
       <w:pPr>
         <w:pStyle w:val="24"/>
+        <w:keepNext w:val="0"/>
         <w:tabs>
           <w:tab w:val="right" w:leader="dot" w:pos="9355"/>
         </w:tabs>
+        <w:spacing w:after="0" w:line="240" w:lineRule="auto"/>
+        <w:rPr>
+          <w:sz w:val="19"/>
+        </w:rPr>
       </w:pPr>
       <w:r>
         <w:rPr>
           <w:rFonts w:ascii="Times New Roman" w:hAnsi="Times New Roman" w:eastAsia="宋体"/>
+          <w:sz w:val="19"/>
         </w:rPr>
         <w:fldChar w:fldCharType="begin"/>
       </w:r>
       <w:r>
         <w:rPr>
           <w:rFonts w:ascii="Times New Roman" w:hAnsi="Times New Roman" w:eastAsia="宋体"/>
-        </w:rPr>
-        <w:instrText xml:space="preserve"> HYPERLINK \l _Toc9806 </w:instrText>
+          <w:sz w:val="19"/>
+        </w:rPr>
+        <w:instrText xml:space="preserve"> HYPERLINK \l _Toc7766 </w:instrText>
       </w:r>
       <w:r>
         <w:rPr>
           <w:rFonts w:ascii="Times New Roman" w:hAnsi="Times New Roman" w:eastAsia="宋体"/>
+          <w:sz w:val="19"/>
         </w:rPr>
         <w:fldChar w:fldCharType="separate"/>
       </w:r>
       <w:r>
+        <w:rPr>
+          <w:sz w:val="19"/>
+        </w:rPr>
         <w:t>2.3.1  账号、资料与导航</w:t>
       </w:r>
       <w:r>
+        <w:rPr>
+          <w:sz w:val="19"/>
+        </w:rPr>
         <w:tab/>
       </w:r>
       <w:r>
+        <w:rPr>
+          <w:sz w:val="19"/>
+        </w:rPr>
         <w:fldChar w:fldCharType="begin"/>
       </w:r>
       <w:r>
-        <w:instrText xml:space="preserve"> PAGEREF _Toc9806 \h </w:instrText>
-      </w:r>
-      <w:r>
+        <w:rPr>
+          <w:sz w:val="19"/>
+        </w:rPr>
+        <w:instrText xml:space="preserve"> PAGEREF _Toc7766 \h </w:instrText>
+      </w:r>
+      <w:r>
+        <w:rPr>
+          <w:sz w:val="19"/>
+        </w:rPr>
         <w:fldChar w:fldCharType="separate"/>
       </w:r>
       <w:r>
+        <w:rPr>
+          <w:sz w:val="19"/>
+        </w:rPr>
         <w:t>7</w:t>
       </w:r>
       <w:r>
+        <w:rPr>
+          <w:sz w:val="19"/>
+        </w:rPr>
         <w:fldChar w:fldCharType="end"/>
       </w:r>
       <w:r>
         <w:rPr>
           <w:rFonts w:ascii="Times New Roman" w:hAnsi="Times New Roman" w:eastAsia="宋体"/>
+          <w:sz w:val="19"/>
         </w:rPr>
         <w:fldChar w:fldCharType="end"/>
       </w:r>
@@ -1550,52 +1940,82 @@
     <w:p>
       <w:pPr>
         <w:pStyle w:val="24"/>
+        <w:keepNext w:val="0"/>
         <w:tabs>
           <w:tab w:val="right" w:leader="dot" w:pos="9355"/>
         </w:tabs>
+        <w:spacing w:after="0" w:line="240" w:lineRule="auto"/>
+        <w:rPr>
+          <w:sz w:val="19"/>
+        </w:rPr>
       </w:pPr>
       <w:r>
         <w:rPr>
           <w:rFonts w:ascii="Times New Roman" w:hAnsi="Times New Roman" w:eastAsia="宋体"/>
+          <w:sz w:val="19"/>
         </w:rPr>
         <w:fldChar w:fldCharType="begin"/>
       </w:r>
       <w:r>
         <w:rPr>
           <w:rFonts w:ascii="Times New Roman" w:hAnsi="Times New Roman" w:eastAsia="宋体"/>
-        </w:rPr>
-        <w:instrText xml:space="preserve"> HYPERLINK \l _Toc30632 </w:instrText>
+          <w:sz w:val="19"/>
+        </w:rPr>
+        <w:instrText xml:space="preserve"> HYPERLINK \l _Toc5977 </w:instrText>
       </w:r>
       <w:r>
         <w:rPr>
           <w:rFonts w:ascii="Times New Roman" w:hAnsi="Times New Roman" w:eastAsia="宋体"/>
+          <w:sz w:val="19"/>
         </w:rPr>
         <w:fldChar w:fldCharType="separate"/>
       </w:r>
       <w:r>
+        <w:rPr>
+          <w:sz w:val="19"/>
+        </w:rPr>
         <w:t>2.3.2  商店、钱包与订单</w:t>
       </w:r>
       <w:r>
+        <w:rPr>
+          <w:sz w:val="19"/>
+        </w:rPr>
         <w:tab/>
       </w:r>
       <w:r>
+        <w:rPr>
+          <w:sz w:val="19"/>
+        </w:rPr>
         <w:fldChar w:fldCharType="begin"/>
       </w:r>
       <w:r>
-        <w:instrText xml:space="preserve"> PAGEREF _Toc30632 \h </w:instrText>
-      </w:r>
-      <w:r>
+        <w:rPr>
+          <w:sz w:val="19"/>
+        </w:rPr>
+        <w:instrText xml:space="preserve"> PAGEREF _Toc5977 \h </w:instrText>
+      </w:r>
+      <w:r>
+        <w:rPr>
+          <w:sz w:val="19"/>
+        </w:rPr>
         <w:fldChar w:fldCharType="separate"/>
       </w:r>
       <w:r>
+        <w:rPr>
+          <w:sz w:val="19"/>
+        </w:rPr>
         <w:t>7</w:t>
       </w:r>
       <w:r>
+        <w:rPr>
+          <w:sz w:val="19"/>
+        </w:rPr>
         <w:fldChar w:fldCharType="end"/>
       </w:r>
       <w:r>
         <w:rPr>
           <w:rFonts w:ascii="Times New Roman" w:hAnsi="Times New Roman" w:eastAsia="宋体"/>
+          <w:sz w:val="19"/>
         </w:rPr>
         <w:fldChar w:fldCharType="end"/>
       </w:r>
@@ -1603,52 +2023,82 @@
     <w:p>
       <w:pPr>
         <w:pStyle w:val="24"/>
+        <w:keepNext w:val="0"/>
         <w:tabs>
           <w:tab w:val="right" w:leader="dot" w:pos="9355"/>
         </w:tabs>
+        <w:spacing w:after="0" w:line="240" w:lineRule="auto"/>
+        <w:rPr>
+          <w:sz w:val="19"/>
+        </w:rPr>
       </w:pPr>
       <w:r>
         <w:rPr>
           <w:rFonts w:ascii="Times New Roman" w:hAnsi="Times New Roman" w:eastAsia="宋体"/>
+          <w:sz w:val="19"/>
         </w:rPr>
         <w:fldChar w:fldCharType="begin"/>
       </w:r>
       <w:r>
         <w:rPr>
           <w:rFonts w:ascii="Times New Roman" w:hAnsi="Times New Roman" w:eastAsia="宋体"/>
-        </w:rPr>
-        <w:instrText xml:space="preserve"> HYPERLINK \l _Toc16379 </w:instrText>
+          <w:sz w:val="19"/>
+        </w:rPr>
+        <w:instrText xml:space="preserve"> HYPERLINK \l _Toc28391 </w:instrText>
       </w:r>
       <w:r>
         <w:rPr>
           <w:rFonts w:ascii="Times New Roman" w:hAnsi="Times New Roman" w:eastAsia="宋体"/>
+          <w:sz w:val="19"/>
         </w:rPr>
         <w:fldChar w:fldCharType="separate"/>
       </w:r>
       <w:r>
+        <w:rPr>
+          <w:sz w:val="19"/>
+        </w:rPr>
         <w:t>2.3.3  库存与社区市场</w:t>
       </w:r>
       <w:r>
+        <w:rPr>
+          <w:sz w:val="19"/>
+        </w:rPr>
         <w:tab/>
       </w:r>
       <w:r>
+        <w:rPr>
+          <w:sz w:val="19"/>
+        </w:rPr>
         <w:fldChar w:fldCharType="begin"/>
       </w:r>
       <w:r>
-        <w:instrText xml:space="preserve"> PAGEREF _Toc16379 \h </w:instrText>
-      </w:r>
-      <w:r>
+        <w:rPr>
+          <w:sz w:val="19"/>
+        </w:rPr>
+        <w:instrText xml:space="preserve"> PAGEREF _Toc28391 \h </w:instrText>
+      </w:r>
+      <w:r>
+        <w:rPr>
+          <w:sz w:val="19"/>
+        </w:rPr>
         <w:fldChar w:fldCharType="separate"/>
       </w:r>
       <w:r>
+        <w:rPr>
+          <w:sz w:val="19"/>
+        </w:rPr>
         <w:t>7</w:t>
       </w:r>
       <w:r>
+        <w:rPr>
+          <w:sz w:val="19"/>
+        </w:rPr>
         <w:fldChar w:fldCharType="end"/>
       </w:r>
       <w:r>
         <w:rPr>
           <w:rFonts w:ascii="Times New Roman" w:hAnsi="Times New Roman" w:eastAsia="宋体"/>
+          <w:sz w:val="19"/>
         </w:rPr>
         <w:fldChar w:fldCharType="end"/>
       </w:r>
@@ -1656,52 +2106,82 @@
     <w:p>
       <w:pPr>
         <w:pStyle w:val="24"/>
+        <w:keepNext w:val="0"/>
         <w:tabs>
           <w:tab w:val="right" w:leader="dot" w:pos="9355"/>
         </w:tabs>
+        <w:spacing w:after="0" w:line="240" w:lineRule="auto"/>
+        <w:rPr>
+          <w:sz w:val="19"/>
+        </w:rPr>
       </w:pPr>
       <w:r>
         <w:rPr>
           <w:rFonts w:ascii="Times New Roman" w:hAnsi="Times New Roman" w:eastAsia="宋体"/>
+          <w:sz w:val="19"/>
         </w:rPr>
         <w:fldChar w:fldCharType="begin"/>
       </w:r>
       <w:r>
         <w:rPr>
           <w:rFonts w:ascii="Times New Roman" w:hAnsi="Times New Roman" w:eastAsia="宋体"/>
-        </w:rPr>
-        <w:instrText xml:space="preserve"> HYPERLINK \l _Toc32148 </w:instrText>
+          <w:sz w:val="19"/>
+        </w:rPr>
+        <w:instrText xml:space="preserve"> HYPERLINK \l _Toc22182 </w:instrText>
       </w:r>
       <w:r>
         <w:rPr>
           <w:rFonts w:ascii="Times New Roman" w:hAnsi="Times New Roman" w:eastAsia="宋体"/>
+          <w:sz w:val="19"/>
         </w:rPr>
         <w:fldChar w:fldCharType="separate"/>
       </w:r>
       <w:r>
+        <w:rPr>
+          <w:sz w:val="19"/>
+        </w:rPr>
         <w:t>2.3.4  社区与社交</w:t>
       </w:r>
       <w:r>
+        <w:rPr>
+          <w:sz w:val="19"/>
+        </w:rPr>
         <w:tab/>
       </w:r>
       <w:r>
+        <w:rPr>
+          <w:sz w:val="19"/>
+        </w:rPr>
         <w:fldChar w:fldCharType="begin"/>
       </w:r>
       <w:r>
-        <w:instrText xml:space="preserve"> PAGEREF _Toc32148 \h </w:instrText>
-      </w:r>
-      <w:r>
+        <w:rPr>
+          <w:sz w:val="19"/>
+        </w:rPr>
+        <w:instrText xml:space="preserve"> PAGEREF _Toc22182 \h </w:instrText>
+      </w:r>
+      <w:r>
+        <w:rPr>
+          <w:sz w:val="19"/>
+        </w:rPr>
         <w:fldChar w:fldCharType="separate"/>
       </w:r>
       <w:r>
+        <w:rPr>
+          <w:sz w:val="19"/>
+        </w:rPr>
         <w:t>7</w:t>
       </w:r>
       <w:r>
+        <w:rPr>
+          <w:sz w:val="19"/>
+        </w:rPr>
         <w:fldChar w:fldCharType="end"/>
       </w:r>
       <w:r>
         <w:rPr>
           <w:rFonts w:ascii="Times New Roman" w:hAnsi="Times New Roman" w:eastAsia="宋体"/>
+          <w:sz w:val="19"/>
         </w:rPr>
         <w:fldChar w:fldCharType="end"/>
       </w:r>
@@ -1709,52 +2189,82 @@
     <w:p>
       <w:pPr>
         <w:pStyle w:val="30"/>
+        <w:keepNext w:val="0"/>
         <w:tabs>
           <w:tab w:val="right" w:leader="dot" w:pos="9355"/>
         </w:tabs>
+        <w:spacing w:after="0" w:line="240" w:lineRule="auto"/>
+        <w:rPr>
+          <w:sz w:val="19"/>
+        </w:rPr>
       </w:pPr>
       <w:r>
         <w:rPr>
           <w:rFonts w:ascii="Times New Roman" w:hAnsi="Times New Roman" w:eastAsia="宋体"/>
+          <w:sz w:val="19"/>
         </w:rPr>
         <w:fldChar w:fldCharType="begin"/>
       </w:r>
       <w:r>
         <w:rPr>
           <w:rFonts w:ascii="Times New Roman" w:hAnsi="Times New Roman" w:eastAsia="宋体"/>
-        </w:rPr>
-        <w:instrText xml:space="preserve"> HYPERLINK \l _Toc24065 </w:instrText>
+          <w:sz w:val="19"/>
+        </w:rPr>
+        <w:instrText xml:space="preserve"> HYPERLINK \l _Toc29088 </w:instrText>
       </w:r>
       <w:r>
         <w:rPr>
           <w:rFonts w:ascii="Times New Roman" w:hAnsi="Times New Roman" w:eastAsia="宋体"/>
+          <w:sz w:val="19"/>
         </w:rPr>
         <w:fldChar w:fldCharType="separate"/>
       </w:r>
       <w:r>
+        <w:rPr>
+          <w:sz w:val="19"/>
+        </w:rPr>
         <w:t>2.4  开发商端需求</w:t>
       </w:r>
       <w:r>
+        <w:rPr>
+          <w:sz w:val="19"/>
+        </w:rPr>
         <w:tab/>
       </w:r>
       <w:r>
+        <w:rPr>
+          <w:sz w:val="19"/>
+        </w:rPr>
         <w:fldChar w:fldCharType="begin"/>
       </w:r>
       <w:r>
-        <w:instrText xml:space="preserve"> PAGEREF _Toc24065 \h </w:instrText>
-      </w:r>
-      <w:r>
+        <w:rPr>
+          <w:sz w:val="19"/>
+        </w:rPr>
+        <w:instrText xml:space="preserve"> PAGEREF _Toc29088 \h </w:instrText>
+      </w:r>
+      <w:r>
+        <w:rPr>
+          <w:sz w:val="19"/>
+        </w:rPr>
         <w:fldChar w:fldCharType="separate"/>
       </w:r>
       <w:r>
-        <w:t>7</w:t>
-      </w:r>
-      <w:r>
+        <w:rPr>
+          <w:sz w:val="19"/>
+        </w:rPr>
+        <w:t>8</w:t>
+      </w:r>
+      <w:r>
+        <w:rPr>
+          <w:sz w:val="19"/>
+        </w:rPr>
         <w:fldChar w:fldCharType="end"/>
       </w:r>
       <w:r>
         <w:rPr>
           <w:rFonts w:ascii="Times New Roman" w:hAnsi="Times New Roman" w:eastAsia="宋体"/>
+          <w:sz w:val="19"/>
         </w:rPr>
         <w:fldChar w:fldCharType="end"/>
       </w:r>
@@ -1762,52 +2272,82 @@
     <w:p>
       <w:pPr>
         <w:pStyle w:val="30"/>
+        <w:keepNext w:val="0"/>
         <w:tabs>
           <w:tab w:val="right" w:leader="dot" w:pos="9355"/>
         </w:tabs>
+        <w:spacing w:after="0" w:line="240" w:lineRule="auto"/>
+        <w:rPr>
+          <w:sz w:val="19"/>
+        </w:rPr>
       </w:pPr>
       <w:r>
         <w:rPr>
           <w:rFonts w:ascii="Times New Roman" w:hAnsi="Times New Roman" w:eastAsia="宋体"/>
+          <w:sz w:val="19"/>
         </w:rPr>
         <w:fldChar w:fldCharType="begin"/>
       </w:r>
       <w:r>
         <w:rPr>
           <w:rFonts w:ascii="Times New Roman" w:hAnsi="Times New Roman" w:eastAsia="宋体"/>
-        </w:rPr>
-        <w:instrText xml:space="preserve"> HYPERLINK \l _Toc6719 </w:instrText>
+          <w:sz w:val="19"/>
+        </w:rPr>
+        <w:instrText xml:space="preserve"> HYPERLINK \l _Toc4545 </w:instrText>
       </w:r>
       <w:r>
         <w:rPr>
           <w:rFonts w:ascii="Times New Roman" w:hAnsi="Times New Roman" w:eastAsia="宋体"/>
+          <w:sz w:val="19"/>
         </w:rPr>
         <w:fldChar w:fldCharType="separate"/>
       </w:r>
       <w:r>
+        <w:rPr>
+          <w:sz w:val="19"/>
+        </w:rPr>
         <w:t>2.5  管理员端需求</w:t>
       </w:r>
       <w:r>
+        <w:rPr>
+          <w:sz w:val="19"/>
+        </w:rPr>
         <w:tab/>
       </w:r>
       <w:r>
+        <w:rPr>
+          <w:sz w:val="19"/>
+        </w:rPr>
         <w:fldChar w:fldCharType="begin"/>
       </w:r>
       <w:r>
-        <w:instrText xml:space="preserve"> PAGEREF _Toc6719 \h </w:instrText>
-      </w:r>
-      <w:r>
+        <w:rPr>
+          <w:sz w:val="19"/>
+        </w:rPr>
+        <w:instrText xml:space="preserve"> PAGEREF _Toc4545 \h </w:instrText>
+      </w:r>
+      <w:r>
+        <w:rPr>
+          <w:sz w:val="19"/>
+        </w:rPr>
         <w:fldChar w:fldCharType="separate"/>
       </w:r>
       <w:r>
+        <w:rPr>
+          <w:sz w:val="19"/>
+        </w:rPr>
         <w:t>8</w:t>
       </w:r>
       <w:r>
+        <w:rPr>
+          <w:sz w:val="19"/>
+        </w:rPr>
         <w:fldChar w:fldCharType="end"/>
       </w:r>
       <w:r>
         <w:rPr>
           <w:rFonts w:ascii="Times New Roman" w:hAnsi="Times New Roman" w:eastAsia="宋体"/>
+          <w:sz w:val="19"/>
         </w:rPr>
         <w:fldChar w:fldCharType="end"/>
       </w:r>
@@ -1815,52 +2355,82 @@
     <w:p>
       <w:pPr>
         <w:pStyle w:val="30"/>
+        <w:keepNext w:val="0"/>
         <w:tabs>
           <w:tab w:val="right" w:leader="dot" w:pos="9355"/>
         </w:tabs>
+        <w:spacing w:after="0" w:line="240" w:lineRule="auto"/>
+        <w:rPr>
+          <w:sz w:val="19"/>
+        </w:rPr>
       </w:pPr>
       <w:r>
         <w:rPr>
           <w:rFonts w:ascii="Times New Roman" w:hAnsi="Times New Roman" w:eastAsia="宋体"/>
+          <w:sz w:val="19"/>
         </w:rPr>
         <w:fldChar w:fldCharType="begin"/>
       </w:r>
       <w:r>
         <w:rPr>
           <w:rFonts w:ascii="Times New Roman" w:hAnsi="Times New Roman" w:eastAsia="宋体"/>
-        </w:rPr>
-        <w:instrText xml:space="preserve"> HYPERLINK \l _Toc4451 </w:instrText>
+          <w:sz w:val="19"/>
+        </w:rPr>
+        <w:instrText xml:space="preserve"> HYPERLINK \l _Toc26406 </w:instrText>
       </w:r>
       <w:r>
         <w:rPr>
           <w:rFonts w:ascii="Times New Roman" w:hAnsi="Times New Roman" w:eastAsia="宋体"/>
+          <w:sz w:val="19"/>
         </w:rPr>
         <w:fldChar w:fldCharType="separate"/>
       </w:r>
       <w:r>
+        <w:rPr>
+          <w:sz w:val="19"/>
+        </w:rPr>
         <w:t>2.6  核心用例规约</w:t>
       </w:r>
       <w:r>
+        <w:rPr>
+          <w:sz w:val="19"/>
+        </w:rPr>
         <w:tab/>
       </w:r>
       <w:r>
+        <w:rPr>
+          <w:sz w:val="19"/>
+        </w:rPr>
         <w:fldChar w:fldCharType="begin"/>
       </w:r>
       <w:r>
-        <w:instrText xml:space="preserve"> PAGEREF _Toc4451 \h </w:instrText>
-      </w:r>
-      <w:r>
+        <w:rPr>
+          <w:sz w:val="19"/>
+        </w:rPr>
+        <w:instrText xml:space="preserve"> PAGEREF _Toc26406 \h </w:instrText>
+      </w:r>
+      <w:r>
+        <w:rPr>
+          <w:sz w:val="19"/>
+        </w:rPr>
         <w:fldChar w:fldCharType="separate"/>
       </w:r>
       <w:r>
+        <w:rPr>
+          <w:sz w:val="19"/>
+        </w:rPr>
         <w:t>8</w:t>
       </w:r>
       <w:r>
+        <w:rPr>
+          <w:sz w:val="19"/>
+        </w:rPr>
         <w:fldChar w:fldCharType="end"/>
       </w:r>
       <w:r>
         <w:rPr>
           <w:rFonts w:ascii="Times New Roman" w:hAnsi="Times New Roman" w:eastAsia="宋体"/>
+          <w:sz w:val="19"/>
         </w:rPr>
         <w:fldChar w:fldCharType="end"/>
       </w:r>
@@ -1868,52 +2438,82 @@
     <w:p>
       <w:pPr>
         <w:pStyle w:val="30"/>
+        <w:keepNext w:val="0"/>
         <w:tabs>
           <w:tab w:val="right" w:leader="dot" w:pos="9355"/>
         </w:tabs>
+        <w:spacing w:after="0" w:line="240" w:lineRule="auto"/>
+        <w:rPr>
+          <w:sz w:val="19"/>
+        </w:rPr>
       </w:pPr>
       <w:r>
         <w:rPr>
           <w:rFonts w:ascii="Times New Roman" w:hAnsi="Times New Roman" w:eastAsia="宋体"/>
+          <w:sz w:val="19"/>
         </w:rPr>
         <w:fldChar w:fldCharType="begin"/>
       </w:r>
       <w:r>
         <w:rPr>
           <w:rFonts w:ascii="Times New Roman" w:hAnsi="Times New Roman" w:eastAsia="宋体"/>
-        </w:rPr>
-        <w:instrText xml:space="preserve"> HYPERLINK \l _Toc6928 </w:instrText>
+          <w:sz w:val="19"/>
+        </w:rPr>
+        <w:instrText xml:space="preserve"> HYPERLINK \l _Toc27344 </w:instrText>
       </w:r>
       <w:r>
         <w:rPr>
           <w:rFonts w:ascii="Times New Roman" w:hAnsi="Times New Roman" w:eastAsia="宋体"/>
+          <w:sz w:val="19"/>
         </w:rPr>
         <w:fldChar w:fldCharType="separate"/>
       </w:r>
       <w:r>
+        <w:rPr>
+          <w:sz w:val="19"/>
+        </w:rPr>
         <w:t>2.7  业务规则</w:t>
       </w:r>
       <w:r>
+        <w:rPr>
+          <w:sz w:val="19"/>
+        </w:rPr>
         <w:tab/>
       </w:r>
       <w:r>
+        <w:rPr>
+          <w:sz w:val="19"/>
+        </w:rPr>
         <w:fldChar w:fldCharType="begin"/>
       </w:r>
       <w:r>
-        <w:instrText xml:space="preserve"> PAGEREF _Toc6928 \h </w:instrText>
-      </w:r>
-      <w:r>
+        <w:rPr>
+          <w:sz w:val="19"/>
+        </w:rPr>
+        <w:instrText xml:space="preserve"> PAGEREF _Toc27344 \h </w:instrText>
+      </w:r>
+      <w:r>
+        <w:rPr>
+          <w:sz w:val="19"/>
+        </w:rPr>
         <w:fldChar w:fldCharType="separate"/>
       </w:r>
       <w:r>
+        <w:rPr>
+          <w:sz w:val="19"/>
+        </w:rPr>
         <w:t>9</w:t>
       </w:r>
       <w:r>
+        <w:rPr>
+          <w:sz w:val="19"/>
+        </w:rPr>
         <w:fldChar w:fldCharType="end"/>
       </w:r>
       <w:r>
         <w:rPr>
           <w:rFonts w:ascii="Times New Roman" w:hAnsi="Times New Roman" w:eastAsia="宋体"/>
+          <w:sz w:val="19"/>
         </w:rPr>
         <w:fldChar w:fldCharType="end"/>
       </w:r>
@@ -1921,52 +2521,82 @@
     <w:p>
       <w:pPr>
         <w:pStyle w:val="30"/>
+        <w:keepNext w:val="0"/>
         <w:tabs>
           <w:tab w:val="right" w:leader="dot" w:pos="9355"/>
         </w:tabs>
+        <w:spacing w:after="0" w:line="240" w:lineRule="auto"/>
+        <w:rPr>
+          <w:sz w:val="19"/>
+        </w:rPr>
       </w:pPr>
       <w:r>
         <w:rPr>
           <w:rFonts w:ascii="Times New Roman" w:hAnsi="Times New Roman" w:eastAsia="宋体"/>
+          <w:sz w:val="19"/>
         </w:rPr>
         <w:fldChar w:fldCharType="begin"/>
       </w:r>
       <w:r>
         <w:rPr>
           <w:rFonts w:ascii="Times New Roman" w:hAnsi="Times New Roman" w:eastAsia="宋体"/>
-        </w:rPr>
-        <w:instrText xml:space="preserve"> HYPERLINK \l _Toc6317 </w:instrText>
+          <w:sz w:val="19"/>
+        </w:rPr>
+        <w:instrText xml:space="preserve"> HYPERLINK \l _Toc9397 </w:instrText>
       </w:r>
       <w:r>
         <w:rPr>
           <w:rFonts w:ascii="Times New Roman" w:hAnsi="Times New Roman" w:eastAsia="宋体"/>
+          <w:sz w:val="19"/>
         </w:rPr>
         <w:fldChar w:fldCharType="separate"/>
       </w:r>
       <w:r>
+        <w:rPr>
+          <w:sz w:val="19"/>
+        </w:rPr>
         <w:t>2.8  数据需求</w:t>
       </w:r>
       <w:r>
+        <w:rPr>
+          <w:sz w:val="19"/>
+        </w:rPr>
         <w:tab/>
       </w:r>
       <w:r>
+        <w:rPr>
+          <w:sz w:val="19"/>
+        </w:rPr>
         <w:fldChar w:fldCharType="begin"/>
       </w:r>
       <w:r>
-        <w:instrText xml:space="preserve"> PAGEREF _Toc6317 \h </w:instrText>
-      </w:r>
-      <w:r>
+        <w:rPr>
+          <w:sz w:val="19"/>
+        </w:rPr>
+        <w:instrText xml:space="preserve"> PAGEREF _Toc9397 \h </w:instrText>
+      </w:r>
+      <w:r>
+        <w:rPr>
+          <w:sz w:val="19"/>
+        </w:rPr>
         <w:fldChar w:fldCharType="separate"/>
       </w:r>
       <w:r>
-        <w:t>9</w:t>
-      </w:r>
-      <w:r>
+        <w:rPr>
+          <w:sz w:val="19"/>
+        </w:rPr>
+        <w:t>10</w:t>
+      </w:r>
+      <w:r>
+        <w:rPr>
+          <w:sz w:val="19"/>
+        </w:rPr>
         <w:fldChar w:fldCharType="end"/>
       </w:r>
       <w:r>
         <w:rPr>
           <w:rFonts w:ascii="Times New Roman" w:hAnsi="Times New Roman" w:eastAsia="宋体"/>
+          <w:sz w:val="19"/>
         </w:rPr>
         <w:fldChar w:fldCharType="end"/>
       </w:r>
@@ -1974,52 +2604,82 @@
     <w:p>
       <w:pPr>
         <w:pStyle w:val="30"/>
+        <w:keepNext w:val="0"/>
         <w:tabs>
           <w:tab w:val="right" w:leader="dot" w:pos="9355"/>
         </w:tabs>
+        <w:spacing w:after="0" w:line="240" w:lineRule="auto"/>
+        <w:rPr>
+          <w:sz w:val="19"/>
+        </w:rPr>
       </w:pPr>
       <w:r>
         <w:rPr>
           <w:rFonts w:ascii="Times New Roman" w:hAnsi="Times New Roman" w:eastAsia="宋体"/>
+          <w:sz w:val="19"/>
         </w:rPr>
         <w:fldChar w:fldCharType="begin"/>
       </w:r>
       <w:r>
         <w:rPr>
           <w:rFonts w:ascii="Times New Roman" w:hAnsi="Times New Roman" w:eastAsia="宋体"/>
-        </w:rPr>
-        <w:instrText xml:space="preserve"> HYPERLINK \l _Toc22552 </w:instrText>
+          <w:sz w:val="19"/>
+        </w:rPr>
+        <w:instrText xml:space="preserve"> HYPERLINK \l _Toc30473 </w:instrText>
       </w:r>
       <w:r>
         <w:rPr>
           <w:rFonts w:ascii="Times New Roman" w:hAnsi="Times New Roman" w:eastAsia="宋体"/>
+          <w:sz w:val="19"/>
         </w:rPr>
         <w:fldChar w:fldCharType="separate"/>
       </w:r>
       <w:r>
+        <w:rPr>
+          <w:sz w:val="19"/>
+        </w:rPr>
         <w:t>2.9  非功能需求</w:t>
       </w:r>
       <w:r>
+        <w:rPr>
+          <w:sz w:val="19"/>
+        </w:rPr>
         <w:tab/>
       </w:r>
       <w:r>
+        <w:rPr>
+          <w:sz w:val="19"/>
+        </w:rPr>
         <w:fldChar w:fldCharType="begin"/>
       </w:r>
       <w:r>
-        <w:instrText xml:space="preserve"> PAGEREF _Toc22552 \h </w:instrText>
-      </w:r>
-      <w:r>
+        <w:rPr>
+          <w:sz w:val="19"/>
+        </w:rPr>
+        <w:instrText xml:space="preserve"> PAGEREF _Toc30473 \h </w:instrText>
+      </w:r>
+      <w:r>
+        <w:rPr>
+          <w:sz w:val="19"/>
+        </w:rPr>
         <w:fldChar w:fldCharType="separate"/>
       </w:r>
       <w:r>
+        <w:rPr>
+          <w:sz w:val="19"/>
+        </w:rPr>
         <w:t>10</w:t>
       </w:r>
       <w:r>
+        <w:rPr>
+          <w:sz w:val="19"/>
+        </w:rPr>
         <w:fldChar w:fldCharType="end"/>
       </w:r>
       <w:r>
         <w:rPr>
           <w:rFonts w:ascii="Times New Roman" w:hAnsi="Times New Roman" w:eastAsia="宋体"/>
+          <w:sz w:val="19"/>
         </w:rPr>
         <w:fldChar w:fldCharType="end"/>
       </w:r>
@@ -2027,52 +2687,82 @@
     <w:p>
       <w:pPr>
         <w:pStyle w:val="30"/>
+        <w:keepNext w:val="0"/>
         <w:tabs>
           <w:tab w:val="right" w:leader="dot" w:pos="9355"/>
         </w:tabs>
+        <w:spacing w:after="0" w:line="240" w:lineRule="auto"/>
+        <w:rPr>
+          <w:sz w:val="19"/>
+        </w:rPr>
       </w:pPr>
       <w:r>
         <w:rPr>
           <w:rFonts w:ascii="Times New Roman" w:hAnsi="Times New Roman" w:eastAsia="宋体"/>
+          <w:sz w:val="19"/>
         </w:rPr>
         <w:fldChar w:fldCharType="begin"/>
       </w:r>
       <w:r>
         <w:rPr>
           <w:rFonts w:ascii="Times New Roman" w:hAnsi="Times New Roman" w:eastAsia="宋体"/>
-        </w:rPr>
-        <w:instrText xml:space="preserve"> HYPERLINK \l _Toc6272 </w:instrText>
+          <w:sz w:val="19"/>
+        </w:rPr>
+        <w:instrText xml:space="preserve"> HYPERLINK \l _Toc21488 </w:instrText>
       </w:r>
       <w:r>
         <w:rPr>
           <w:rFonts w:ascii="Times New Roman" w:hAnsi="Times New Roman" w:eastAsia="宋体"/>
+          <w:sz w:val="19"/>
         </w:rPr>
         <w:fldChar w:fldCharType="separate"/>
       </w:r>
       <w:r>
+        <w:rPr>
+          <w:sz w:val="19"/>
+        </w:rPr>
         <w:t>2.10  接口与外部环境需求</w:t>
       </w:r>
       <w:r>
+        <w:rPr>
+          <w:sz w:val="19"/>
+        </w:rPr>
         <w:tab/>
       </w:r>
       <w:r>
+        <w:rPr>
+          <w:sz w:val="19"/>
+        </w:rPr>
         <w:fldChar w:fldCharType="begin"/>
       </w:r>
       <w:r>
-        <w:instrText xml:space="preserve"> PAGEREF _Toc6272 \h </w:instrText>
-      </w:r>
-      <w:r>
+        <w:rPr>
+          <w:sz w:val="19"/>
+        </w:rPr>
+        <w:instrText xml:space="preserve"> PAGEREF _Toc21488 \h </w:instrText>
+      </w:r>
+      <w:r>
+        <w:rPr>
+          <w:sz w:val="19"/>
+        </w:rPr>
         <w:fldChar w:fldCharType="separate"/>
       </w:r>
       <w:r>
+        <w:rPr>
+          <w:sz w:val="19"/>
+        </w:rPr>
         <w:t>11</w:t>
       </w:r>
       <w:r>
+        <w:rPr>
+          <w:sz w:val="19"/>
+        </w:rPr>
         <w:fldChar w:fldCharType="end"/>
       </w:r>
       <w:r>
         <w:rPr>
           <w:rFonts w:ascii="Times New Roman" w:hAnsi="Times New Roman" w:eastAsia="宋体"/>
+          <w:sz w:val="19"/>
         </w:rPr>
         <w:fldChar w:fldCharType="end"/>
       </w:r>
@@ -2080,52 +2770,82 @@
     <w:p>
       <w:pPr>
         <w:pStyle w:val="30"/>
+        <w:keepNext w:val="0"/>
         <w:tabs>
           <w:tab w:val="right" w:leader="dot" w:pos="9355"/>
         </w:tabs>
+        <w:spacing w:after="0" w:line="240" w:lineRule="auto"/>
+        <w:rPr>
+          <w:sz w:val="19"/>
+        </w:rPr>
       </w:pPr>
       <w:r>
         <w:rPr>
           <w:rFonts w:ascii="Times New Roman" w:hAnsi="Times New Roman" w:eastAsia="宋体"/>
+          <w:sz w:val="19"/>
         </w:rPr>
         <w:fldChar w:fldCharType="begin"/>
       </w:r>
       <w:r>
         <w:rPr>
           <w:rFonts w:ascii="Times New Roman" w:hAnsi="Times New Roman" w:eastAsia="宋体"/>
-        </w:rPr>
-        <w:instrText xml:space="preserve"> HYPERLINK \l _Toc9476 </w:instrText>
+          <w:sz w:val="19"/>
+        </w:rPr>
+        <w:instrText xml:space="preserve"> HYPERLINK \l _Toc1474 </w:instrText>
       </w:r>
       <w:r>
         <w:rPr>
           <w:rFonts w:ascii="Times New Roman" w:hAnsi="Times New Roman" w:eastAsia="宋体"/>
+          <w:sz w:val="19"/>
         </w:rPr>
         <w:fldChar w:fldCharType="separate"/>
       </w:r>
       <w:r>
+        <w:rPr>
+          <w:sz w:val="19"/>
+        </w:rPr>
         <w:t>2.11  验收场景</w:t>
       </w:r>
       <w:r>
+        <w:rPr>
+          <w:sz w:val="19"/>
+        </w:rPr>
         <w:tab/>
       </w:r>
       <w:r>
+        <w:rPr>
+          <w:sz w:val="19"/>
+        </w:rPr>
         <w:fldChar w:fldCharType="begin"/>
       </w:r>
       <w:r>
-        <w:instrText xml:space="preserve"> PAGEREF _Toc9476 \h </w:instrText>
-      </w:r>
-      <w:r>
+        <w:rPr>
+          <w:sz w:val="19"/>
+        </w:rPr>
+        <w:instrText xml:space="preserve"> PAGEREF _Toc1474 \h </w:instrText>
+      </w:r>
+      <w:r>
+        <w:rPr>
+          <w:sz w:val="19"/>
+        </w:rPr>
         <w:fldChar w:fldCharType="separate"/>
       </w:r>
       <w:r>
+        <w:rPr>
+          <w:sz w:val="19"/>
+        </w:rPr>
         <w:t>11</w:t>
       </w:r>
       <w:r>
+        <w:rPr>
+          <w:sz w:val="19"/>
+        </w:rPr>
         <w:fldChar w:fldCharType="end"/>
       </w:r>
       <w:r>
         <w:rPr>
           <w:rFonts w:ascii="Times New Roman" w:hAnsi="Times New Roman" w:eastAsia="宋体"/>
+          <w:sz w:val="19"/>
         </w:rPr>
         <w:fldChar w:fldCharType="end"/>
       </w:r>
@@ -2133,52 +2853,82 @@
     <w:p>
       <w:pPr>
         <w:pStyle w:val="30"/>
+        <w:keepNext w:val="0"/>
         <w:tabs>
           <w:tab w:val="right" w:leader="dot" w:pos="9355"/>
         </w:tabs>
+        <w:spacing w:after="0" w:line="240" w:lineRule="auto"/>
+        <w:rPr>
+          <w:sz w:val="19"/>
+        </w:rPr>
       </w:pPr>
       <w:r>
         <w:rPr>
           <w:rFonts w:ascii="Times New Roman" w:hAnsi="Times New Roman" w:eastAsia="宋体"/>
+          <w:sz w:val="19"/>
         </w:rPr>
         <w:fldChar w:fldCharType="begin"/>
       </w:r>
       <w:r>
         <w:rPr>
           <w:rFonts w:ascii="Times New Roman" w:hAnsi="Times New Roman" w:eastAsia="宋体"/>
-        </w:rPr>
-        <w:instrText xml:space="preserve"> HYPERLINK \l _Toc31027 </w:instrText>
+          <w:sz w:val="19"/>
+        </w:rPr>
+        <w:instrText xml:space="preserve"> HYPERLINK \l _Toc2603 </w:instrText>
       </w:r>
       <w:r>
         <w:rPr>
           <w:rFonts w:ascii="Times New Roman" w:hAnsi="Times New Roman" w:eastAsia="宋体"/>
+          <w:sz w:val="19"/>
         </w:rPr>
         <w:fldChar w:fldCharType="separate"/>
       </w:r>
       <w:r>
+        <w:rPr>
+          <w:sz w:val="19"/>
+        </w:rPr>
         <w:t>2.12  需求追踪矩阵</w:t>
       </w:r>
       <w:r>
+        <w:rPr>
+          <w:sz w:val="19"/>
+        </w:rPr>
         <w:tab/>
       </w:r>
       <w:r>
+        <w:rPr>
+          <w:sz w:val="19"/>
+        </w:rPr>
         <w:fldChar w:fldCharType="begin"/>
       </w:r>
       <w:r>
-        <w:instrText xml:space="preserve"> PAGEREF _Toc31027 \h </w:instrText>
-      </w:r>
-      <w:r>
+        <w:rPr>
+          <w:sz w:val="19"/>
+        </w:rPr>
+        <w:instrText xml:space="preserve"> PAGEREF _Toc2603 \h </w:instrText>
+      </w:r>
+      <w:r>
+        <w:rPr>
+          <w:sz w:val="19"/>
+        </w:rPr>
         <w:fldChar w:fldCharType="separate"/>
       </w:r>
       <w:r>
+        <w:rPr>
+          <w:sz w:val="19"/>
+        </w:rPr>
         <w:t>12</w:t>
       </w:r>
       <w:r>
+        <w:rPr>
+          <w:sz w:val="19"/>
+        </w:rPr>
         <w:fldChar w:fldCharType="end"/>
       </w:r>
       <w:r>
         <w:rPr>
           <w:rFonts w:ascii="Times New Roman" w:hAnsi="Times New Roman" w:eastAsia="宋体"/>
+          <w:sz w:val="19"/>
         </w:rPr>
         <w:fldChar w:fldCharType="end"/>
       </w:r>
@@ -2186,52 +2936,82 @@
     <w:p>
       <w:pPr>
         <w:pStyle w:val="27"/>
+        <w:keepNext w:val="0"/>
         <w:tabs>
           <w:tab w:val="right" w:leader="dot" w:pos="9355"/>
         </w:tabs>
+        <w:spacing w:after="0" w:line="240" w:lineRule="auto"/>
+        <w:rPr>
+          <w:sz w:val="19"/>
+        </w:rPr>
       </w:pPr>
       <w:r>
         <w:rPr>
           <w:rFonts w:ascii="Times New Roman" w:hAnsi="Times New Roman" w:eastAsia="宋体"/>
+          <w:sz w:val="19"/>
         </w:rPr>
         <w:fldChar w:fldCharType="begin"/>
       </w:r>
       <w:r>
         <w:rPr>
           <w:rFonts w:ascii="Times New Roman" w:hAnsi="Times New Roman" w:eastAsia="宋体"/>
-        </w:rPr>
-        <w:instrText xml:space="preserve"> HYPERLINK \l _Toc9889 </w:instrText>
+          <w:sz w:val="19"/>
+        </w:rPr>
+        <w:instrText xml:space="preserve"> HYPERLINK \l _Toc5383 </w:instrText>
       </w:r>
       <w:r>
         <w:rPr>
           <w:rFonts w:ascii="Times New Roman" w:hAnsi="Times New Roman" w:eastAsia="宋体"/>
+          <w:sz w:val="19"/>
         </w:rPr>
         <w:fldChar w:fldCharType="separate"/>
       </w:r>
       <w:r>
+        <w:rPr>
+          <w:sz w:val="19"/>
+        </w:rPr>
         <w:t>附录 A  图表索引</w:t>
       </w:r>
       <w:r>
+        <w:rPr>
+          <w:sz w:val="19"/>
+        </w:rPr>
         <w:tab/>
       </w:r>
       <w:r>
+        <w:rPr>
+          <w:sz w:val="19"/>
+        </w:rPr>
         <w:fldChar w:fldCharType="begin"/>
       </w:r>
       <w:r>
-        <w:instrText xml:space="preserve"> PAGEREF _Toc9889 \h </w:instrText>
-      </w:r>
-      <w:r>
+        <w:rPr>
+          <w:sz w:val="19"/>
+        </w:rPr>
+        <w:instrText xml:space="preserve"> PAGEREF _Toc5383 \h </w:instrText>
+      </w:r>
+      <w:r>
+        <w:rPr>
+          <w:sz w:val="19"/>
+        </w:rPr>
         <w:fldChar w:fldCharType="separate"/>
       </w:r>
       <w:r>
+        <w:rPr>
+          <w:sz w:val="19"/>
+        </w:rPr>
         <w:t>13</w:t>
       </w:r>
       <w:r>
+        <w:rPr>
+          <w:sz w:val="19"/>
+        </w:rPr>
         <w:fldChar w:fldCharType="end"/>
       </w:r>
       <w:r>
         <w:rPr>
           <w:rFonts w:ascii="Times New Roman" w:hAnsi="Times New Roman" w:eastAsia="宋体"/>
+          <w:sz w:val="19"/>
         </w:rPr>
         <w:fldChar w:fldCharType="end"/>
       </w:r>
@@ -2239,52 +3019,82 @@
     <w:p>
       <w:pPr>
         <w:pStyle w:val="30"/>
+        <w:keepNext w:val="0"/>
         <w:tabs>
           <w:tab w:val="right" w:leader="dot" w:pos="9355"/>
         </w:tabs>
+        <w:spacing w:after="0" w:line="240" w:lineRule="auto"/>
+        <w:rPr>
+          <w:sz w:val="19"/>
+        </w:rPr>
       </w:pPr>
       <w:r>
         <w:rPr>
           <w:rFonts w:ascii="Times New Roman" w:hAnsi="Times New Roman" w:eastAsia="宋体"/>
+          <w:sz w:val="19"/>
         </w:rPr>
         <w:fldChar w:fldCharType="begin"/>
       </w:r>
       <w:r>
         <w:rPr>
           <w:rFonts w:ascii="Times New Roman" w:hAnsi="Times New Roman" w:eastAsia="宋体"/>
-        </w:rPr>
-        <w:instrText xml:space="preserve"> HYPERLINK \l _Toc6867 </w:instrText>
+          <w:sz w:val="19"/>
+        </w:rPr>
+        <w:instrText xml:space="preserve"> HYPERLINK \l _Toc15132 </w:instrText>
       </w:r>
       <w:r>
         <w:rPr>
           <w:rFonts w:ascii="Times New Roman" w:hAnsi="Times New Roman" w:eastAsia="宋体"/>
+          <w:sz w:val="19"/>
         </w:rPr>
         <w:fldChar w:fldCharType="separate"/>
       </w:r>
       <w:r>
+        <w:rPr>
+          <w:sz w:val="19"/>
+        </w:rPr>
         <w:t>A.1  图索引</w:t>
       </w:r>
       <w:r>
+        <w:rPr>
+          <w:sz w:val="19"/>
+        </w:rPr>
         <w:tab/>
       </w:r>
       <w:r>
+        <w:rPr>
+          <w:sz w:val="19"/>
+        </w:rPr>
         <w:fldChar w:fldCharType="begin"/>
       </w:r>
       <w:r>
-        <w:instrText xml:space="preserve"> PAGEREF _Toc6867 \h </w:instrText>
-      </w:r>
-      <w:r>
+        <w:rPr>
+          <w:sz w:val="19"/>
+        </w:rPr>
+        <w:instrText xml:space="preserve"> PAGEREF _Toc15132 \h </w:instrText>
+      </w:r>
+      <w:r>
+        <w:rPr>
+          <w:sz w:val="19"/>
+        </w:rPr>
         <w:fldChar w:fldCharType="separate"/>
       </w:r>
       <w:r>
+        <w:rPr>
+          <w:sz w:val="19"/>
+        </w:rPr>
         <w:t>13</w:t>
       </w:r>
       <w:r>
+        <w:rPr>
+          <w:sz w:val="19"/>
+        </w:rPr>
         <w:fldChar w:fldCharType="end"/>
       </w:r>
       <w:r>
         <w:rPr>
           <w:rFonts w:ascii="Times New Roman" w:hAnsi="Times New Roman" w:eastAsia="宋体"/>
+          <w:sz w:val="19"/>
         </w:rPr>
         <w:fldChar w:fldCharType="end"/>
       </w:r>
@@ -2292,63 +3102,99 @@
     <w:p>
       <w:pPr>
         <w:pStyle w:val="30"/>
+        <w:keepNext w:val="0"/>
         <w:tabs>
           <w:tab w:val="right" w:leader="dot" w:pos="9355"/>
         </w:tabs>
+        <w:spacing w:after="0" w:line="240" w:lineRule="auto"/>
+        <w:rPr>
+          <w:sz w:val="19"/>
+        </w:rPr>
       </w:pPr>
       <w:r>
         <w:rPr>
           <w:rFonts w:ascii="Times New Roman" w:hAnsi="Times New Roman" w:eastAsia="宋体"/>
+          <w:sz w:val="19"/>
         </w:rPr>
         <w:fldChar w:fldCharType="begin"/>
       </w:r>
       <w:r>
         <w:rPr>
           <w:rFonts w:ascii="Times New Roman" w:hAnsi="Times New Roman" w:eastAsia="宋体"/>
-        </w:rPr>
-        <w:instrText xml:space="preserve"> HYPERLINK \l _Toc6521 </w:instrText>
+          <w:sz w:val="19"/>
+        </w:rPr>
+        <w:instrText xml:space="preserve"> HYPERLINK \l _Toc2060 </w:instrText>
       </w:r>
       <w:r>
         <w:rPr>
           <w:rFonts w:ascii="Times New Roman" w:hAnsi="Times New Roman" w:eastAsia="宋体"/>
+          <w:sz w:val="19"/>
         </w:rPr>
         <w:fldChar w:fldCharType="separate"/>
       </w:r>
       <w:r>
+        <w:rPr>
+          <w:sz w:val="19"/>
+        </w:rPr>
         <w:t>A.2  表索引</w:t>
       </w:r>
       <w:r>
+        <w:rPr>
+          <w:sz w:val="19"/>
+        </w:rPr>
         <w:tab/>
       </w:r>
       <w:r>
+        <w:rPr>
+          <w:sz w:val="19"/>
+        </w:rPr>
         <w:fldChar w:fldCharType="begin"/>
       </w:r>
       <w:r>
-        <w:instrText xml:space="preserve"> PAGEREF _Toc6521 \h </w:instrText>
-      </w:r>
-      <w:r>
+        <w:rPr>
+          <w:sz w:val="19"/>
+        </w:rPr>
+        <w:instrText xml:space="preserve"> PAGEREF _Toc2060 \h </w:instrText>
+      </w:r>
+      <w:r>
+        <w:rPr>
+          <w:sz w:val="19"/>
+        </w:rPr>
         <w:fldChar w:fldCharType="separate"/>
       </w:r>
       <w:r>
+        <w:rPr>
+          <w:sz w:val="19"/>
+        </w:rPr>
         <w:t>13</w:t>
       </w:r>
       <w:r>
+        <w:rPr>
+          <w:sz w:val="19"/>
+        </w:rPr>
         <w:fldChar w:fldCharType="end"/>
       </w:r>
       <w:r>
         <w:rPr>
           <w:rFonts w:ascii="Times New Roman" w:hAnsi="Times New Roman" w:eastAsia="宋体"/>
+          <w:sz w:val="19"/>
         </w:rPr>
         <w:fldChar w:fldCharType="end"/>
       </w:r>
     </w:p>
     <w:p>
       <w:pPr>
+        <w:keepNext w:val="0"/>
+        <w:spacing w:after="0" w:line="240" w:lineRule="auto"/>
         <w:ind w:firstLine="0"/>
+        <w:rPr>
+          <w:sz w:val="19"/>
+        </w:rPr>
       </w:pPr>
       <w:r>
         <w:rPr>
           <w:rFonts w:ascii="Times New Roman" w:hAnsi="Times New Roman" w:eastAsia="宋体"/>
+          <w:sz w:val="19"/>
         </w:rPr>
         <w:fldChar w:fldCharType="end"/>
       </w:r>
@@ -2371,7 +3217,7 @@
       <w:pPr>
         <w:pStyle w:val="3"/>
       </w:pPr>
-      <w:bookmarkStart w:id="0" w:name="_Toc27092"/>
+      <w:bookmarkStart w:id="0" w:name="_Toc2507"/>
       <w:r>
         <w:t>1  系统需求概述</w:t>
       </w:r>
@@ -2381,7 +3227,7 @@
       <w:pPr>
         <w:pStyle w:val="4"/>
       </w:pPr>
-      <w:bookmarkStart w:id="1" w:name="_Toc6002"/>
+      <w:bookmarkStart w:id="1" w:name="_Toc16683"/>
       <w:r>
         <w:t>1.1  项目背景</w:t>
       </w:r>
@@ -2397,7 +3243,7 @@
           <w:rFonts w:ascii="Times New Roman" w:hAnsi="Times New Roman" w:eastAsia="宋体"/>
           <w:sz w:val="21"/>
         </w:rPr>
-        <w:t>Steam-数字游戏平台系统是面向数据库课程设计的综合信息系统。系统以真实数字游戏分发平台的核心业务为参照，覆盖商店、钱包、订单、退款、CDKey、游戏库、评价、成就、库存、社区市场、好友社交、创意工坊、开发商运营和管理员审核。项目不追求复制商业平台的全部规模，而是以可验证的业务闭环展示关系数据库建模、事务一致性、并发控制、权限隔离、审计追踪与工程化部署能力。</w:t>
+        <w:t>Steam-数字游戏平台系统是面向数据库课程设计的综合信息系统。系统以真实数字游戏分发平台的核心业务为参照，覆盖商店、钱包、订单、退款、CDKey、游戏库、评价、成就、库存、社区市场、好友社交、创意工坊、开发商运营和管理员治理。项目不追求复制商业平台的全部规模，而是以可验证的业务闭环展示关系数据库建模、事务一致性、并发控制、权限隔离、审计追踪与工程化部署能力。</w:t>
       </w:r>
     </w:p>
     <w:p>
@@ -2478,7 +3324,7 @@
       <w:pPr>
         <w:pStyle w:val="4"/>
       </w:pPr>
-      <w:bookmarkStart w:id="3" w:name="_Toc5829"/>
+      <w:bookmarkStart w:id="3" w:name="_Toc22556"/>
       <w:r>
         <w:t>1.2  建设目标</w:t>
       </w:r>
@@ -2566,7 +3412,7 @@
       <w:pPr>
         <w:pStyle w:val="4"/>
       </w:pPr>
-      <w:bookmarkStart w:id="4" w:name="_Toc30452"/>
+      <w:bookmarkStart w:id="4" w:name="_Toc25929"/>
       <w:r>
         <w:t>1.3  系统范围与边界</w:t>
       </w:r>
@@ -2789,7 +3635,7 @@
                 <w:b w:val="0"/>
                 <w:sz w:val="17"/>
               </w:rPr>
-              <w:t>游戏浏览、详情、价格、媒体、开发商提交、管理员审核、公告</w:t>
+              <w:t>游戏浏览、详情、价格、媒体、开发商维护、管理员上/下架、公告</w:t>
             </w:r>
           </w:p>
         </w:tc>
@@ -3230,7 +4076,7 @@
       <w:pPr>
         <w:pStyle w:val="4"/>
       </w:pPr>
-      <w:bookmarkStart w:id="6" w:name="_Toc6117"/>
+      <w:bookmarkStart w:id="6" w:name="_Toc27702"/>
       <w:r>
         <w:t>1.4  用户角色与职责</w:t>
       </w:r>
@@ -3289,6 +4135,12 @@
             <w:insideH w:val="single" w:color="auto" w:sz="4" w:space="0"/>
             <w:insideV w:val="single" w:color="auto" w:sz="4" w:space="0"/>
           </w:tblBorders>
+          <w:tblCellMar>
+            <w:top w:w="0" w:type="dxa"/>
+            <w:left w:w="108" w:type="dxa"/>
+            <w:bottom w:w="0" w:type="dxa"/>
+            <w:right w:w="108" w:type="dxa"/>
+          </w:tblCellMar>
         </w:tblPrEx>
         <w:trPr>
           <w:tblHeader/>
@@ -3728,7 +4580,7 @@
                 <w:b w:val="0"/>
                 <w:sz w:val="16"/>
               </w:rPr>
-              <w:t>提交并运营自有游戏</w:t>
+              <w:t>维护并运营自有游戏</w:t>
             </w:r>
           </w:p>
         </w:tc>
@@ -3754,7 +4606,7 @@
                 <w:b w:val="0"/>
                 <w:sz w:val="16"/>
               </w:rPr>
-              <w:t>维护归属自己的游戏、提交审核、生成归属游戏的 CDKey 批次</w:t>
+              <w:t>创建和编辑归属自己的游戏、删除 OFFLINE 游戏、生成归属游戏的 CDKey 批次</w:t>
             </w:r>
           </w:p>
         </w:tc>
@@ -3780,7 +4632,7 @@
                 <w:b w:val="0"/>
                 <w:sz w:val="16"/>
               </w:rPr>
-              <w:t>修改其他开发商游戏或管理员审核状态</w:t>
+              <w:t>修改其他开发商游戏或自行改变上/下架状态</w:t>
             </w:r>
           </w:p>
         </w:tc>
@@ -3854,7 +4706,7 @@
                 <w:b w:val="0"/>
                 <w:sz w:val="16"/>
               </w:rPr>
-              <w:t>治理平台与保障演示</w:t>
+              <w:t>治理平台</w:t>
             </w:r>
           </w:p>
         </w:tc>
@@ -3880,7 +4732,7 @@
                 <w:b w:val="0"/>
                 <w:sz w:val="16"/>
               </w:rPr>
-              <w:t>审核游戏和退款、维护公告、查看运营任务、恢复演示基线</w:t>
+              <w:t>切换游戏上/下架状态、审核退款、维护公告和查看运营任务</w:t>
             </w:r>
           </w:p>
         </w:tc>
@@ -3921,7 +4773,7 @@
       <w:pPr>
         <w:pStyle w:val="4"/>
       </w:pPr>
-      <w:bookmarkStart w:id="8" w:name="_Toc7370"/>
+      <w:bookmarkStart w:id="8" w:name="_Toc7873"/>
       <w:r>
         <w:t>1.5  固定演示数据与业务定位</w:t>
       </w:r>
@@ -4298,7 +5150,7 @@
       <w:pPr>
         <w:pStyle w:val="4"/>
       </w:pPr>
-      <w:bookmarkStart w:id="10" w:name="_Toc4706"/>
+      <w:bookmarkStart w:id="10" w:name="_Toc31005"/>
       <w:r>
         <w:t>1.6  技术与运行约束</w:t>
       </w:r>
@@ -4353,7 +5205,7 @@
           <w:rFonts w:ascii="Times New Roman" w:hAnsi="Times New Roman" w:eastAsia="宋体"/>
           <w:sz w:val="21"/>
         </w:rPr>
-        <w:t>数据库：Oracle 18c 以上；当前部署使用 Oracle Database Free / Oracle 26ai Free。</w:t>
+        <w:t>数据库：Oracle 18c 以上；项目采用 Oracle Database Free，仓库部署口径为 Oracle 26ai Free，运行时精确版本以部署镜像及 v$version 查询为准。</w:t>
       </w:r>
     </w:p>
     <w:p>
@@ -4366,7 +5218,7 @@
           <w:rFonts w:ascii="Times New Roman" w:hAnsi="Times New Roman" w:eastAsia="宋体"/>
           <w:sz w:val="21"/>
         </w:rPr>
-        <w:t>数据访问：Dapper + ODP.NET 为主要路径，Oracle.EntityFrameworkCore 用于兼容课程 ORM 要求和扩展。</w:t>
+        <w:t>数据访问：当前业务路径使用 Dapper + ODP.NET 执行参数化 SQL；Oracle.EntityFrameworkCore 已作为依赖保留，但成品没有启用 DbContext/实体映射。</w:t>
       </w:r>
     </w:p>
     <w:p>
@@ -4399,7 +5251,7 @@
       <w:pPr>
         <w:pStyle w:val="4"/>
       </w:pPr>
-      <w:bookmarkStart w:id="11" w:name="_Toc12915"/>
+      <w:bookmarkStart w:id="11" w:name="_Toc31812"/>
       <w:r>
         <w:t>1.7  功能演进与架构深化说明</w:t>
       </w:r>
@@ -4428,7 +5280,7 @@
           <w:rFonts w:ascii="Times New Roman" w:hAnsi="Times New Roman" w:eastAsia="宋体"/>
           <w:sz w:val="21"/>
         </w:rPr>
-        <w:t>释放出的工作量被投入到数据库深度：Oracle 行级锁和冲突处理、市场并发撮合、资金与资产唯一真相源、不可变账本、多主体数据隔离、审批与审计、持久化好友私信、SignalR 实时通知以及可恢复的答辩数据基线。该调整使系统从“功能面广但逻辑浅”转为“闭环完整且数据库特征可证明”。</w:t>
+        <w:t>释放出的工作量被投入到数据库深度：Oracle 行级锁和冲突处理、市场并发撮合、资金与资产唯一真相源、不可变账本、多主体数据隔离、状态治理与退款审计、持久化好友私信、SignalR 实时通知以及可恢复的答辩数据基线。该调整使系统从“功能面广但逻辑浅”转为“闭环完整且数据库特征可证明”。</w:t>
       </w:r>
     </w:p>
     <w:p>
@@ -4976,7 +5828,7 @@
                 <w:b w:val="0"/>
                 <w:sz w:val="16"/>
               </w:rPr>
-              <w:t>开发商归属隔离、上架审批和 CDKey 审计</w:t>
+              <w:t>开发商归属隔离、管理员上/下架治理和 CDKey 审计</w:t>
             </w:r>
           </w:p>
         </w:tc>
@@ -5065,7 +5917,7 @@
       <w:pPr>
         <w:pStyle w:val="3"/>
       </w:pPr>
-      <w:bookmarkStart w:id="14" w:name="_Toc26277"/>
+      <w:bookmarkStart w:id="14" w:name="_Toc17291"/>
       <w:r>
         <w:t>2  系统需求分析</w:t>
       </w:r>
@@ -5075,7 +5927,7 @@
       <w:pPr>
         <w:pStyle w:val="4"/>
       </w:pPr>
-      <w:bookmarkStart w:id="15" w:name="_Toc2063"/>
+      <w:bookmarkStart w:id="15" w:name="_Toc9515"/>
       <w:r>
         <w:t>2.1  总体业务场景</w:t>
       </w:r>
@@ -5091,14 +5943,14 @@
           <w:rFonts w:ascii="Times New Roman" w:hAnsi="Times New Roman" w:eastAsia="宋体"/>
           <w:sz w:val="21"/>
         </w:rPr>
-        <w:t>访客从商店进入系统；玩家注册登录后可充值并购买 DST，也可将免费游戏 CS2 加入库。拥有游戏后，玩家可评价、获取成就、领取或交易物品，并通过好友、私信、动态、讨论和工坊参与社区。开发商维护自有游戏与 CDKey；管理员审核上架和退款、发布公告并在答辩前恢复演示数据。所有会改变资金、权益或资产的行为必须落入 Oracle 事务并形成可追溯记录。</w:t>
+        <w:t>访客从商店进入系统；玩家注册登录后可充值并购买 DST，也可将免费游戏 CS2 加入库。拥有游戏后，玩家可评价、解锁项目演示成就、领取或交易物品，并通过好友、私信、动态、讨论和工坊参与社区。开发商维护自有游戏与 CDKey；管理员治理游戏上/下架、审核退款并发布公告；负责人/运维在答辩前通过 C# 工具恢复演示数据。所有会改变资金、权益或资产的行为必须落入 Oracle 事务并形成可追溯记录。</w:t>
       </w:r>
     </w:p>
     <w:p>
       <w:pPr>
         <w:pStyle w:val="4"/>
       </w:pPr>
-      <w:bookmarkStart w:id="16" w:name="_Toc14400"/>
+      <w:bookmarkStart w:id="16" w:name="_Toc7393"/>
       <w:r>
         <w:t>2.2  功能需求总表</w:t>
       </w:r>
@@ -5732,7 +6584,7 @@
                 <w:b w:val="0"/>
                 <w:sz w:val="15"/>
               </w:rPr>
-              <w:t>按类型、价格、状态检索已发布游戏</w:t>
+              <w:t>按类型、价格、状态检索 ONLINE 游戏</w:t>
             </w:r>
           </w:p>
         </w:tc>
@@ -5982,7 +6834,7 @@
                 <w:b w:val="0"/>
                 <w:sz w:val="15"/>
               </w:rPr>
-              <w:t>游戏提交与维护</w:t>
+              <w:t>开发商游戏维护</w:t>
             </w:r>
           </w:p>
         </w:tc>
@@ -6034,7 +6886,7 @@
                 <w:b w:val="0"/>
                 <w:sz w:val="15"/>
               </w:rPr>
-              <w:t>创建、编辑归属自己的游戏并提交审核</w:t>
+              <w:t>创建、编辑归属自己的游戏；新建游戏固定为 OFFLINE</w:t>
             </w:r>
           </w:p>
         </w:tc>
@@ -6133,7 +6985,7 @@
                 <w:b w:val="0"/>
                 <w:sz w:val="15"/>
               </w:rPr>
-              <w:t>游戏审核与发布</w:t>
+              <w:t>游戏上架与下架</w:t>
             </w:r>
           </w:p>
         </w:tc>
@@ -6185,7 +7037,7 @@
                 <w:b w:val="0"/>
                 <w:sz w:val="15"/>
               </w:rPr>
-              <w:t>审核通过后对商店可见，拒绝则保留意见</w:t>
+              <w:t>在 ONLINE/OFFLINE 间切换状态并控制公开可见性</w:t>
             </w:r>
           </w:p>
         </w:tc>
@@ -7091,7 +7943,7 @@
                 <w:b w:val="0"/>
                 <w:sz w:val="15"/>
               </w:rPr>
-              <w:t>按状态和资格申请，审核通过后原子回退权益和资金</w:t>
+              <w:t>按资格申请；批准后原子撤销权益并按原支付方式退款</w:t>
             </w:r>
           </w:p>
         </w:tc>
@@ -7643,7 +8495,7 @@
                 <w:b w:val="0"/>
                 <w:sz w:val="15"/>
               </w:rPr>
-              <w:t>成就授予与展示</w:t>
+              <w:t>成就解锁与展示</w:t>
             </w:r>
           </w:p>
         </w:tc>
@@ -7695,7 +8547,7 @@
                 <w:b w:val="0"/>
                 <w:sz w:val="15"/>
               </w:rPr>
-              <w:t>根据项目定义的演示条件授予成就并展示进度</w:t>
+              <w:t>验证游戏库资格后解锁项目定义的演示成就并展示</w:t>
             </w:r>
           </w:p>
         </w:tc>
@@ -8752,7 +9604,7 @@
                 <w:b w:val="0"/>
                 <w:sz w:val="15"/>
               </w:rPr>
-              <w:t>发送、接受、拒绝或删除好友关系</w:t>
+              <w:t>发送好友申请、接受待处理申请并查询好友及共同游戏</w:t>
             </w:r>
           </w:p>
         </w:tc>
@@ -9095,6 +9947,12 @@
             <w:insideH w:val="single" w:color="auto" w:sz="4" w:space="0"/>
             <w:insideV w:val="single" w:color="auto" w:sz="4" w:space="0"/>
           </w:tblBorders>
+          <w:tblCellMar>
+            <w:top w:w="0" w:type="dxa"/>
+            <w:left w:w="108" w:type="dxa"/>
+            <w:bottom w:w="0" w:type="dxa"/>
+            <w:right w:w="108" w:type="dxa"/>
+          </w:tblCellMar>
         </w:tblPrEx>
         <w:trPr>
           <w:jc w:val="center"/>
@@ -9199,7 +10057,7 @@
                 <w:b w:val="0"/>
                 <w:sz w:val="15"/>
               </w:rPr>
-              <w:t>发布工坊条目、订阅/取消订阅并维护计数</w:t>
+              <w:t>浏览已发布工坊条目，订阅/取消订阅并维护唯一关系与计数</w:t>
             </w:r>
           </w:p>
         </w:tc>
@@ -9954,7 +10812,7 @@
                 <w:b w:val="0"/>
                 <w:sz w:val="15"/>
               </w:rPr>
-              <w:t>查询待审任务并记录审核主体、原因和时间</w:t>
+              <w:t>处理待审退款并记录审核主体、原因和时间；治理游戏状态与公告</w:t>
             </w:r>
           </w:p>
         </w:tc>
@@ -10079,7 +10937,7 @@
                 <w:b w:val="0"/>
                 <w:sz w:val="15"/>
               </w:rPr>
-              <w:t>管理员</w:t>
+              <w:t>负责人/运维</w:t>
             </w:r>
           </w:p>
         </w:tc>
@@ -10105,7 +10963,7 @@
                 <w:b w:val="0"/>
                 <w:sz w:val="15"/>
               </w:rPr>
-              <w:t>受保护地恢复确定性数据基线并记录审计</w:t>
+              <w:t>通过受保护的 C# 命令行工具恢复确定性数据基线并记录审计</w:t>
             </w:r>
           </w:p>
         </w:tc>
@@ -10159,7 +11017,7 @@
       <w:pPr>
         <w:pStyle w:val="4"/>
       </w:pPr>
-      <w:bookmarkStart w:id="18" w:name="_Toc16149"/>
+      <w:bookmarkStart w:id="18" w:name="_Toc22321"/>
       <w:r>
         <w:t>2.3  玩家端需求</w:t>
       </w:r>
@@ -10169,7 +11027,7 @@
       <w:pPr>
         <w:pStyle w:val="5"/>
       </w:pPr>
-      <w:bookmarkStart w:id="19" w:name="_Toc9806"/>
+      <w:bookmarkStart w:id="19" w:name="_Toc7766"/>
       <w:r>
         <w:t>2.3.1  账号、资料与导航</w:t>
       </w:r>
@@ -10231,7 +11089,7 @@
       <w:pPr>
         <w:pStyle w:val="5"/>
       </w:pPr>
-      <w:bookmarkStart w:id="20" w:name="_Toc30632"/>
+      <w:bookmarkStart w:id="20" w:name="_Toc5977"/>
       <w:r>
         <w:t>2.3.2  商店、钱包与订单</w:t>
       </w:r>
@@ -10247,7 +11105,7 @@
           <w:rFonts w:ascii="Times New Roman" w:hAnsi="Times New Roman" w:eastAsia="宋体"/>
           <w:sz w:val="21"/>
         </w:rPr>
-        <w:t>商店只显示审核通过且已发布的游戏；搜索、筛选、排序和详情均可直接访问。</w:t>
+        <w:t>商店只显示 status=ONLINE 的游戏；搜索、筛选、排序和详情均可直接访问。</w:t>
       </w:r>
     </w:p>
     <w:p>
@@ -10299,14 +11157,14 @@
           <w:rFonts w:ascii="Times New Roman" w:hAnsi="Times New Roman" w:eastAsia="宋体"/>
           <w:sz w:val="21"/>
         </w:rPr>
-        <w:t>退款只针对当前玩家可退款订单；管理员批准后回退游戏库权益并增加余额，且保留申请和审核日志。</w:t>
+        <w:t>退款只针对当前玩家可退款订单；管理员批准后把游戏库权益置为 REVOKED，并按原支付方式处理退款：STEAM_WALLET 原路回到钱包并写流水，外部演示支付只更新支付/退款事实，不虚增钱包。</w:t>
       </w:r>
     </w:p>
     <w:p>
       <w:pPr>
         <w:pStyle w:val="5"/>
       </w:pPr>
-      <w:bookmarkStart w:id="21" w:name="_Toc16379"/>
+      <w:bookmarkStart w:id="21" w:name="_Toc28391"/>
       <w:r>
         <w:t>2.3.3  库存与社区市场</w:t>
       </w:r>
@@ -10348,7 +11206,7 @@
           <w:rFonts w:ascii="Times New Roman" w:hAnsi="Times New Roman" w:eastAsia="宋体"/>
           <w:sz w:val="21"/>
         </w:rPr>
-        <w:t>挂单将物品由可用转为市场锁定；撤单和成交只能由合法状态转换触发。</w:t>
+        <w:t>卖出挂单将物品由 NORMAL 转为 IN_MARKET；撤单或成交后恢复为 NORMAL，并只允许合法状态转换。</w:t>
       </w:r>
     </w:p>
     <w:p>
@@ -10381,7 +11239,7 @@
       <w:pPr>
         <w:pStyle w:val="5"/>
       </w:pPr>
-      <w:bookmarkStart w:id="22" w:name="_Toc32148"/>
+      <w:bookmarkStart w:id="22" w:name="_Toc22182"/>
       <w:r>
         <w:t>2.3.4  社区与社交</w:t>
       </w:r>
@@ -10410,7 +11268,7 @@
           <w:rFonts w:ascii="Times New Roman" w:hAnsi="Times New Roman" w:eastAsia="宋体"/>
           <w:sz w:val="21"/>
         </w:rPr>
-        <w:t>好友关系具有待处理、已接受、已拒绝等状态；只有双方关系满足规则时才可私信。</w:t>
+        <w:t>应用支持发送好友申请和接受待处理申请；只有 ACCEPTED 关系的双方才可读取会话和发送私信。数据库还为后续 DECLINED/BLOCKED 状态保留约束，但当前界面不提供拒绝、屏蔽或删除操作。</w:t>
       </w:r>
     </w:p>
     <w:p>
@@ -10443,7 +11301,7 @@
       <w:pPr>
         <w:pStyle w:val="4"/>
       </w:pPr>
-      <w:bookmarkStart w:id="23" w:name="_Toc24065"/>
+      <w:bookmarkStart w:id="23" w:name="_Toc29088"/>
       <w:r>
         <w:t>2.4  开发商端需求</w:t>
       </w:r>
@@ -10459,7 +11317,7 @@
           <w:rFonts w:ascii="Times New Roman" w:hAnsi="Times New Roman" w:eastAsia="宋体"/>
           <w:sz w:val="21"/>
         </w:rPr>
-        <w:t>开发商登录后进入独立工作区，可创建和编辑归属自己的游戏草稿，提交管理员审核。</w:t>
+        <w:t>开发商登录后进入独立工作区，可创建和编辑归属自己的游戏；新建游戏固定为 OFFLINE。</w:t>
       </w:r>
     </w:p>
     <w:p>
@@ -10472,7 +11330,7 @@
           <w:rFonts w:ascii="Times New Roman" w:hAnsi="Times New Roman" w:eastAsia="宋体"/>
           <w:sz w:val="21"/>
         </w:rPr>
-        <w:t>开发商不得直接把游戏改为已发布状态，也不得读取或修改其他开发商的游戏和 CDKey 批次。</w:t>
+        <w:t>开发商不得直接改变游戏的 ONLINE/OFFLINE 状态，也不得读取或修改其他开发商的游戏和 CDKey 批次；只有 OFFLINE 游戏允许删除。</w:t>
       </w:r>
     </w:p>
     <w:p>
@@ -10498,14 +11356,14 @@
           <w:rFonts w:ascii="Times New Roman" w:hAnsi="Times New Roman" w:eastAsia="宋体"/>
           <w:sz w:val="21"/>
         </w:rPr>
-        <w:t>游戏在审核期间和已发布后允许的可编辑字段应受到状态约束，关键状态变化留存时间与责任主体。</w:t>
+        <w:t>管理员通过独立授权端点把游戏设置为 ONLINE 或 OFFLINE；ONLINE 游戏向公众可见，OFFLINE 游戏仅归属开发商和管理员可见。</w:t>
       </w:r>
     </w:p>
     <w:p>
       <w:pPr>
         <w:pStyle w:val="4"/>
       </w:pPr>
-      <w:bookmarkStart w:id="24" w:name="_Toc6719"/>
+      <w:bookmarkStart w:id="24" w:name="_Toc4545"/>
       <w:r>
         <w:t>2.5  管理员端需求</w:t>
       </w:r>
@@ -10521,7 +11379,7 @@
           <w:rFonts w:ascii="Times New Roman" w:hAnsi="Times New Roman" w:eastAsia="宋体"/>
           <w:sz w:val="21"/>
         </w:rPr>
-        <w:t>管理员审核开发商提交的游戏，明确记录通过或拒绝、审核意见和时间。</w:t>
+        <w:t>管理员治理游戏上/下架状态，只能在 ONLINE 与 OFFLINE 之间切换；系统不声称实现游戏审批意见或通过/拒绝工作流。</w:t>
       </w:r>
     </w:p>
     <w:p>
@@ -10560,14 +11418,14 @@
           <w:rFonts w:ascii="Times New Roman" w:hAnsi="Times New Roman" w:eastAsia="宋体"/>
           <w:sz w:val="21"/>
         </w:rPr>
-        <w:t>演示数据恢复入口仅管理员可访问，必须具有显式确认、运行记录、逐表结果和防并发保护。</w:t>
+        <w:t>演示数据恢复不是 Web 管理端功能；负责人/运维通过 SteamPlatform.DemoData C# 命令行工具执行，并输入 RESET-DEMO-DATA 或 RESTORE-DEMO-DATA 确认串。运行、逐表快照及阶段事件必须写入审计表。</w:t>
       </w:r>
     </w:p>
     <w:p>
       <w:pPr>
         <w:pStyle w:val="4"/>
       </w:pPr>
-      <w:bookmarkStart w:id="25" w:name="_Toc4451"/>
+      <w:bookmarkStart w:id="25" w:name="_Toc26406"/>
       <w:r>
         <w:t>2.6  核心用例规约</w:t>
       </w:r>
@@ -11134,7 +11992,7 @@
                 <w:b w:val="0"/>
                 <w:sz w:val="14"/>
               </w:rPr>
-              <w:t>玩家登录；DST 已发布；余额充足；未拥有</w:t>
+              <w:t>玩家登录；DST 为 ONLINE；未拥有；钱包支付时余额充足</w:t>
             </w:r>
           </w:p>
         </w:tc>
@@ -11160,7 +12018,7 @@
                 <w:b w:val="0"/>
                 <w:sz w:val="14"/>
               </w:rPr>
-              <w:t>确认价格并提交幂等键</w:t>
+              <w:t>选择支付方式并提交幂等键</w:t>
             </w:r>
           </w:p>
         </w:tc>
@@ -11186,7 +12044,7 @@
                 <w:b w:val="0"/>
                 <w:sz w:val="14"/>
               </w:rPr>
-              <w:t>锁钱包；建订单与明细；扣款；写支付/流水/状态；加入库</w:t>
+              <w:t>校验价格与资格；钱包方式锁钱包并扣款；外部方式记录模拟支付；建订单/明细/支付/状态并加入库</w:t>
             </w:r>
           </w:p>
         </w:tc>
@@ -11389,7 +12247,7 @@
                 <w:b w:val="0"/>
                 <w:sz w:val="14"/>
               </w:rPr>
-              <w:t>写工单；审批时锁定订单和钱包；回退权益；返还余额；写日志</w:t>
+              <w:t>写工单；审批时锁定关键事实；库权益置 REVOKED；钱包支付则返还钱包并写流水，外部支付则更新支付/退款事实；写审核日志</w:t>
             </w:r>
           </w:p>
         </w:tc>
@@ -11441,7 +12299,7 @@
                 <w:b w:val="0"/>
                 <w:sz w:val="14"/>
               </w:rPr>
-              <w:t>退款完成且账本可追溯</w:t>
+              <w:t>退款完成且事实可追溯</w:t>
             </w:r>
           </w:p>
         </w:tc>
@@ -12326,7 +13184,7 @@
                 <w:b w:val="0"/>
                 <w:sz w:val="14"/>
               </w:rPr>
-              <w:t>开发商上架游戏</w:t>
+              <w:t>开发商维护与管理员上架</w:t>
             </w:r>
           </w:p>
         </w:tc>
@@ -12352,7 +13210,7 @@
                 <w:b w:val="0"/>
                 <w:sz w:val="14"/>
               </w:rPr>
-              <w:t>开发商登录</w:t>
+              <w:t>开发商账号和管理员账号可用</w:t>
             </w:r>
           </w:p>
         </w:tc>
@@ -12378,7 +13236,7 @@
                 <w:b w:val="0"/>
                 <w:sz w:val="14"/>
               </w:rPr>
-              <w:t>维护草稿并提交</w:t>
+              <w:t>开发商创建 OFFLINE 游戏；管理员设置 ONLINE</w:t>
             </w:r>
           </w:p>
         </w:tc>
@@ -12404,7 +13262,7 @@
                 <w:b w:val="0"/>
                 <w:sz w:val="14"/>
               </w:rPr>
-              <w:t>验证归属；提交审核；管理员审批；发布后商店可见</w:t>
+              <w:t>验证开发商归属；写入游戏；管理员授权端点更新状态；公开商店按 ONLINE 过滤</w:t>
             </w:r>
           </w:p>
         </w:tc>
@@ -12430,7 +13288,7 @@
                 <w:b w:val="0"/>
                 <w:sz w:val="14"/>
               </w:rPr>
-              <w:t>跨开发商访问或越权发布</w:t>
+              <w:t>跨开发商访问或开发商越权改状态</w:t>
             </w:r>
           </w:p>
         </w:tc>
@@ -12456,7 +13314,7 @@
                 <w:b w:val="0"/>
                 <w:sz w:val="14"/>
               </w:rPr>
-              <w:t>形成完整审核链</w:t>
+              <w:t>游戏公开可见且角色边界有效</w:t>
             </w:r>
           </w:p>
         </w:tc>
@@ -12555,7 +13413,7 @@
                 <w:b w:val="0"/>
                 <w:sz w:val="14"/>
               </w:rPr>
-              <w:t>管理员登录并确认</w:t>
+              <w:t>负责人/运维可登录服务器并持有数据库连接配置</w:t>
             </w:r>
           </w:p>
         </w:tc>
@@ -12581,7 +13439,7 @@
                 <w:b w:val="0"/>
                 <w:sz w:val="14"/>
               </w:rPr>
-              <w:t>触发恢复</w:t>
+              <w:t>运行 C# 工具并输入确认串</w:t>
             </w:r>
           </w:p>
         </w:tc>
@@ -12607,7 +13465,7 @@
                 <w:b w:val="0"/>
                 <w:sz w:val="14"/>
               </w:rPr>
-              <w:t>获得排他运行权；按计划清理与回灌；逐表记录；验证基线</w:t>
+              <w:t>建立快照；在事务中清理与回灌；验证最低基线；逐表和逐阶段审计；必要时按 run-id 恢复快照</w:t>
             </w:r>
           </w:p>
         </w:tc>
@@ -12633,7 +13491,7 @@
                 <w:b w:val="0"/>
                 <w:sz w:val="14"/>
               </w:rPr>
-              <w:t>已有任务运行或执行失败</w:t>
+              <w:t>确认串错误、SQL 不安全或执行失败</w:t>
             </w:r>
           </w:p>
         </w:tc>
@@ -12659,7 +13517,7 @@
                 <w:b w:val="0"/>
                 <w:sz w:val="14"/>
               </w:rPr>
-              <w:t>可重复获得确定性答辩状态</w:t>
+              <w:t>可重复获得确定性答辩状态或恢复执行前快照</w:t>
             </w:r>
           </w:p>
         </w:tc>
@@ -12674,7 +13532,7 @@
       <w:pPr>
         <w:pStyle w:val="4"/>
       </w:pPr>
-      <w:bookmarkStart w:id="27" w:name="_Toc6928"/>
+      <w:bookmarkStart w:id="27" w:name="_Toc27344"/>
       <w:r>
         <w:t>2.7  业务规则</w:t>
       </w:r>
@@ -13123,7 +13981,7 @@
                 <w:b w:val="0"/>
                 <w:sz w:val="16"/>
               </w:rPr>
-              <w:t>购买、退款和市场成交必须同时更新余额并写 WALLET_TRANSACTION；不允许只改余额不记流水。</w:t>
+              <w:t>钱包购买、钱包退款、充值和市场结算必须同时更新余额并写 WALLET_TRANSACTION；外部演示支付只更新支付/退款事实，不伪造钱包变动。</w:t>
             </w:r>
           </w:p>
         </w:tc>
@@ -13523,7 +14381,7 @@
                 <w:b w:val="0"/>
                 <w:sz w:val="16"/>
               </w:rPr>
-              <w:t>订单、退款、挂单、好友、报价和审核只允许定义好的单向状态转换。</w:t>
+              <w:t>订单、退款、市场订单、库存、好友、报价和游戏上/下架只允许定义好的状态转换。</w:t>
             </w:r>
           </w:p>
         </w:tc>
@@ -14038,7 +14896,7 @@
       <w:pPr>
         <w:pStyle w:val="4"/>
       </w:pPr>
-      <w:bookmarkStart w:id="29" w:name="_Toc6317"/>
+      <w:bookmarkStart w:id="29" w:name="_Toc9397"/>
       <w:r>
         <w:t>2.8  数据需求</w:t>
       </w:r>
@@ -14387,7 +15245,7 @@
                 <w:b w:val="0"/>
                 <w:sz w:val="16"/>
               </w:rPr>
-              <w:t>游戏归属开发商；审核状态受控；密钥唯一且兑换不可逆</w:t>
+              <w:t>游戏归属开发商；ONLINE/OFFLINE 状态受控；密钥唯一且兑换不可逆</w:t>
             </w:r>
           </w:p>
         </w:tc>
@@ -14902,7 +15760,7 @@
       <w:pPr>
         <w:pStyle w:val="4"/>
       </w:pPr>
-      <w:bookmarkStart w:id="31" w:name="_Toc22552"/>
+      <w:bookmarkStart w:id="31" w:name="_Toc30473"/>
       <w:r>
         <w:t>2.9  非功能需求</w:t>
       </w:r>
@@ -16355,7 +17213,7 @@
       <w:pPr>
         <w:pStyle w:val="4"/>
       </w:pPr>
-      <w:bookmarkStart w:id="33" w:name="_Toc6272"/>
+      <w:bookmarkStart w:id="33" w:name="_Toc21488"/>
       <w:r>
         <w:t>2.10  接口与外部环境需求</w:t>
       </w:r>
@@ -16430,7 +17288,7 @@
       <w:pPr>
         <w:pStyle w:val="4"/>
       </w:pPr>
-      <w:bookmarkStart w:id="34" w:name="_Toc9476"/>
+      <w:bookmarkStart w:id="34" w:name="_Toc1474"/>
       <w:r>
         <w:t>2.11  验收场景</w:t>
       </w:r>
@@ -17086,7 +17944,7 @@
                 <w:b w:val="0"/>
                 <w:sz w:val="16"/>
               </w:rPr>
-              <w:t>两个开发商分别维护自有游戏与 CDKey，再尝试交叉访问</w:t>
+              <w:t>两个开发商分别维护自有游戏与 CDKey，再尝试交叉访问；管理员切换游戏状态</w:t>
             </w:r>
           </w:p>
         </w:tc>
@@ -17112,7 +17970,7 @@
                 <w:b w:val="0"/>
                 <w:sz w:val="16"/>
               </w:rPr>
-              <w:t>各自可用，跨开发商访问被拒绝，管理员审核后商店状态更新</w:t>
+              <w:t>各自资源可用，跨开发商访问被拒绝，ONLINE/OFFLINE 与商店可见性一致</w:t>
             </w:r>
           </w:p>
         </w:tc>
@@ -17338,7 +18196,7 @@
                 <w:b w:val="0"/>
                 <w:sz w:val="16"/>
               </w:rPr>
-              <w:t>管理员执行演示恢复，然后运行自动化回归</w:t>
+              <w:t>负责人/运维执行 C# 演示恢复工具，然后运行自动化回归</w:t>
             </w:r>
           </w:p>
         </w:tc>
@@ -17364,7 +18222,7 @@
                 <w:b w:val="0"/>
                 <w:sz w:val="16"/>
               </w:rPr>
-              <w:t>恢复到确定基线，381 项本地测试、云端 API/E2E 与数据库断言通过</w:t>
+              <w:t>恢复到确定基线，解决方案测试、云端 API/E2E 与数据库断言通过</w:t>
             </w:r>
           </w:p>
         </w:tc>
@@ -17385,19 +18243,14 @@
           <w:rFonts w:ascii="Times New Roman" w:hAnsi="Times New Roman" w:eastAsia="宋体"/>
           <w:sz w:val="21"/>
         </w:rPr>
-        <w:t>验收执行应先恢复演示基线，再按 AT-01 至 AT-06 顺序推进。每个场景同时观察页面反馈、API 返回和 Oracle 事实；涉及余额、权益、物品和审核的场景必须核对前后状态，不能只以“按钮显示成功”作为通过依据。</w:t>
-      </w:r>
-    </w:p>
-    <w:p>
-      <w:r>
-        <w:br w:type="page"/>
+        <w:t>验收执行应先恢复演示基线，再按 AT-01 至 AT-06 顺序推进。每个场景同时观察页面反馈、API 返回和 Oracle 事实；涉及余额、权益、物品、退款审核和游戏状态治理的场景必须核对前后状态，不能只以“按钮显示成功”作为通过依据。</w:t>
       </w:r>
     </w:p>
     <w:p>
       <w:pPr>
         <w:pStyle w:val="4"/>
       </w:pPr>
-      <w:bookmarkStart w:id="36" w:name="_Toc31027"/>
+      <w:bookmarkStart w:id="36" w:name="_Toc2603"/>
       <w:r>
         <w:t>2.12  需求追踪矩阵</w:t>
       </w:r>
@@ -18457,7 +19310,7 @@
                 <w:b w:val="0"/>
                 <w:sz w:val="16"/>
               </w:rPr>
-              <w:t>DemoDataPlanTests、Admin 端 E2E</w:t>
+              <w:t>Admin 端 E2E、DemoDataPlanTests、命令行恢复演练</w:t>
             </w:r>
           </w:p>
         </w:tc>
@@ -18611,7 +19464,7 @@
       <w:pPr>
         <w:pStyle w:val="3"/>
       </w:pPr>
-      <w:bookmarkStart w:id="38" w:name="_Toc9889"/>
+      <w:bookmarkStart w:id="38" w:name="_Toc5383"/>
       <w:r>
         <w:t>附录 A  图表索引</w:t>
       </w:r>
@@ -18621,7 +19474,7 @@
       <w:pPr>
         <w:pStyle w:val="4"/>
       </w:pPr>
-      <w:bookmarkStart w:id="39" w:name="_Toc6867"/>
+      <w:bookmarkStart w:id="39" w:name="_Toc15132"/>
       <w:r>
         <w:t>A.1  图索引</w:t>
       </w:r>
@@ -18848,7 +19701,7 @@
       <w:pPr>
         <w:pStyle w:val="4"/>
       </w:pPr>
-      <w:bookmarkStart w:id="40" w:name="_Toc6521"/>
+      <w:bookmarkStart w:id="40" w:name="_Toc2060"/>
       <w:r>
         <w:t>A.2  表索引</w:t>
       </w:r>
@@ -19255,7 +20108,7 @@
                 <w:rFonts w:ascii="Times New Roman" w:hAnsi="Times New Roman" w:eastAsia="宋体"/>
                 <w:sz w:val="17"/>
               </w:rPr>
-              <w:t>9</w:t>
+              <w:t>10</w:t>
             </w:r>
             <w:r>
               <w:rPr>
@@ -20513,32 +21366,32 @@
     <w:lsdException w:uiPriority="99" w:name="endnote reference"/>
     <w:lsdException w:uiPriority="99" w:name="endnote text"/>
     <w:lsdException w:uiPriority="99" w:name="table of authorities"/>
-    <w:lsdException w:qFormat="1" w:uiPriority="99" w:semiHidden="0" w:name="macro"/>
+    <w:lsdException w:uiPriority="99" w:semiHidden="0" w:name="macro"/>
     <w:lsdException w:uiPriority="99" w:name="toa heading"/>
     <w:lsdException w:uiPriority="99" w:semiHidden="0" w:name="List"/>
     <w:lsdException w:uiPriority="99" w:semiHidden="0" w:name="List Bullet"/>
     <w:lsdException w:uiPriority="99" w:semiHidden="0" w:name="List Number"/>
-    <w:lsdException w:qFormat="1" w:uiPriority="99" w:semiHidden="0" w:name="List 2"/>
-    <w:lsdException w:qFormat="1" w:uiPriority="99" w:semiHidden="0" w:name="List 3"/>
+    <w:lsdException w:uiPriority="99" w:semiHidden="0" w:name="List 2"/>
+    <w:lsdException w:uiPriority="99" w:semiHidden="0" w:name="List 3"/>
     <w:lsdException w:uiPriority="99" w:name="List 4"/>
     <w:lsdException w:uiPriority="99" w:name="List 5"/>
-    <w:lsdException w:qFormat="1" w:uiPriority="99" w:semiHidden="0" w:name="List Bullet 2"/>
-    <w:lsdException w:qFormat="1" w:uiPriority="99" w:semiHidden="0" w:name="List Bullet 3"/>
+    <w:lsdException w:uiPriority="99" w:semiHidden="0" w:name="List Bullet 2"/>
+    <w:lsdException w:uiPriority="99" w:semiHidden="0" w:name="List Bullet 3"/>
     <w:lsdException w:uiPriority="99" w:name="List Bullet 4"/>
     <w:lsdException w:uiPriority="99" w:name="List Bullet 5"/>
     <w:lsdException w:uiPriority="99" w:semiHidden="0" w:name="List Number 2"/>
-    <w:lsdException w:qFormat="1" w:uiPriority="99" w:semiHidden="0" w:name="List Number 3"/>
+    <w:lsdException w:uiPriority="99" w:semiHidden="0" w:name="List Number 3"/>
     <w:lsdException w:uiPriority="99" w:name="List Number 4"/>
     <w:lsdException w:uiPriority="99" w:name="List Number 5"/>
     <w:lsdException w:qFormat="1" w:unhideWhenUsed="0" w:uiPriority="10" w:semiHidden="0" w:name="Title"/>
     <w:lsdException w:uiPriority="99" w:name="Closing"/>
     <w:lsdException w:uiPriority="99" w:name="Signature"/>
-    <w:lsdException w:qFormat="1" w:uiPriority="1" w:name="Default Paragraph Font"/>
-    <w:lsdException w:qFormat="1" w:uiPriority="99" w:semiHidden="0" w:name="Body Text"/>
+    <w:lsdException w:uiPriority="1" w:name="Default Paragraph Font"/>
+    <w:lsdException w:uiPriority="99" w:semiHidden="0" w:name="Body Text"/>
     <w:lsdException w:uiPriority="99" w:name="Body Text Indent"/>
-    <w:lsdException w:qFormat="1" w:uiPriority="99" w:semiHidden="0" w:name="List Continue"/>
-    <w:lsdException w:qFormat="1" w:uiPriority="99" w:semiHidden="0" w:name="List Continue 2"/>
-    <w:lsdException w:qFormat="1" w:uiPriority="99" w:semiHidden="0" w:name="List Continue 3"/>
+    <w:lsdException w:uiPriority="99" w:semiHidden="0" w:name="List Continue"/>
+    <w:lsdException w:uiPriority="99" w:semiHidden="0" w:name="List Continue 2"/>
+    <w:lsdException w:uiPriority="99" w:semiHidden="0" w:name="List Continue 3"/>
     <w:lsdException w:uiPriority="99" w:name="List Continue 4"/>
     <w:lsdException w:uiPriority="99" w:name="List Continue 5"/>
     <w:lsdException w:uiPriority="99" w:name="Message Header"/>
@@ -20548,8 +21401,8 @@
     <w:lsdException w:uiPriority="99" w:name="Body Text First Indent"/>
     <w:lsdException w:uiPriority="99" w:name="Body Text First Indent 2"/>
     <w:lsdException w:uiPriority="99" w:name="Note Heading"/>
-    <w:lsdException w:qFormat="1" w:uiPriority="99" w:semiHidden="0" w:name="Body Text 2"/>
-    <w:lsdException w:qFormat="1" w:uiPriority="99" w:semiHidden="0" w:name="Body Text 3"/>
+    <w:lsdException w:uiPriority="99" w:semiHidden="0" w:name="Body Text 2"/>
+    <w:lsdException w:uiPriority="99" w:semiHidden="0" w:name="Body Text 3"/>
     <w:lsdException w:uiPriority="99" w:name="Body Text Indent 2"/>
     <w:lsdException w:uiPriority="99" w:name="Body Text Indent 3"/>
     <w:lsdException w:uiPriority="99" w:name="Block Text"/>
@@ -20619,14 +21472,14 @@
     <w:lsdException w:unhideWhenUsed="0" w:uiPriority="59" w:semiHidden="0" w:name="Table Grid"/>
     <w:lsdException w:uiPriority="99" w:name="Table Theme"/>
     <w:lsdException w:qFormat="1" w:unhideWhenUsed="0" w:uiPriority="1" w:semiHidden="0" w:name="No Spacing"/>
-    <w:lsdException w:qFormat="1" w:unhideWhenUsed="0" w:uiPriority="60" w:semiHidden="0" w:name="Light Shading"/>
+    <w:lsdException w:unhideWhenUsed="0" w:uiPriority="60" w:semiHidden="0" w:name="Light Shading"/>
     <w:lsdException w:unhideWhenUsed="0" w:uiPriority="61" w:semiHidden="0" w:name="Light List"/>
-    <w:lsdException w:qFormat="1" w:unhideWhenUsed="0" w:uiPriority="62" w:semiHidden="0" w:name="Light Grid"/>
+    <w:lsdException w:unhideWhenUsed="0" w:uiPriority="62" w:semiHidden="0" w:name="Light Grid"/>
     <w:lsdException w:unhideWhenUsed="0" w:uiPriority="63" w:semiHidden="0" w:name="Medium Shading 1"/>
     <w:lsdException w:unhideWhenUsed="0" w:uiPriority="64" w:semiHidden="0" w:name="Medium Shading 2"/>
-    <w:lsdException w:qFormat="1" w:unhideWhenUsed="0" w:uiPriority="65" w:semiHidden="0" w:name="Medium List 1"/>
+    <w:lsdException w:unhideWhenUsed="0" w:uiPriority="65" w:semiHidden="0" w:name="Medium List 1"/>
     <w:lsdException w:unhideWhenUsed="0" w:uiPriority="66" w:semiHidden="0" w:name="Medium List 2"/>
-    <w:lsdException w:qFormat="1" w:unhideWhenUsed="0" w:uiPriority="67" w:semiHidden="0" w:name="Medium Grid 1"/>
+    <w:lsdException w:unhideWhenUsed="0" w:uiPriority="67" w:semiHidden="0" w:name="Medium Grid 1"/>
     <w:lsdException w:unhideWhenUsed="0" w:uiPriority="68" w:semiHidden="0" w:name="Medium Grid 2"/>
     <w:lsdException w:unhideWhenUsed="0" w:uiPriority="69" w:semiHidden="0" w:name="Medium Grid 3"/>
     <w:lsdException w:unhideWhenUsed="0" w:uiPriority="70" w:semiHidden="0" w:name="Dark List"/>
@@ -20634,44 +21487,44 @@
     <w:lsdException w:unhideWhenUsed="0" w:uiPriority="72" w:semiHidden="0" w:name="Colorful List"/>
     <w:lsdException w:unhideWhenUsed="0" w:uiPriority="73" w:semiHidden="0" w:name="Colorful Grid"/>
     <w:lsdException w:unhideWhenUsed="0" w:uiPriority="60" w:semiHidden="0" w:name="Light Shading Accent 1"/>
-    <w:lsdException w:qFormat="1" w:unhideWhenUsed="0" w:uiPriority="61" w:semiHidden="0" w:name="Light List Accent 1"/>
+    <w:lsdException w:unhideWhenUsed="0" w:uiPriority="61" w:semiHidden="0" w:name="Light List Accent 1"/>
     <w:lsdException w:unhideWhenUsed="0" w:uiPriority="62" w:semiHidden="0" w:name="Light Grid Accent 1"/>
     <w:lsdException w:unhideWhenUsed="0" w:uiPriority="63" w:semiHidden="0" w:name="Medium Shading 1 Accent 1"/>
-    <w:lsdException w:qFormat="1" w:unhideWhenUsed="0" w:uiPriority="64" w:semiHidden="0" w:name="Medium Shading 2 Accent 1"/>
+    <w:lsdException w:unhideWhenUsed="0" w:uiPriority="64" w:semiHidden="0" w:name="Medium Shading 2 Accent 1"/>
     <w:lsdException w:unhideWhenUsed="0" w:uiPriority="65" w:semiHidden="0" w:name="Medium List 1 Accent 1"/>
     <w:lsdException w:qFormat="1" w:unhideWhenUsed="0" w:uiPriority="34" w:semiHidden="0" w:name="List Paragraph"/>
     <w:lsdException w:qFormat="1" w:unhideWhenUsed="0" w:uiPriority="29" w:semiHidden="0" w:name="Quote"/>
     <w:lsdException w:qFormat="1" w:unhideWhenUsed="0" w:uiPriority="30" w:semiHidden="0" w:name="Intense Quote"/>
-    <w:lsdException w:qFormat="1" w:unhideWhenUsed="0" w:uiPriority="66" w:semiHidden="0" w:name="Medium List 2 Accent 1"/>
-    <w:lsdException w:qFormat="1" w:unhideWhenUsed="0" w:uiPriority="67" w:semiHidden="0" w:name="Medium Grid 1 Accent 1"/>
+    <w:lsdException w:unhideWhenUsed="0" w:uiPriority="66" w:semiHidden="0" w:name="Medium List 2 Accent 1"/>
+    <w:lsdException w:unhideWhenUsed="0" w:uiPriority="67" w:semiHidden="0" w:name="Medium Grid 1 Accent 1"/>
     <w:lsdException w:unhideWhenUsed="0" w:uiPriority="68" w:semiHidden="0" w:name="Medium Grid 2 Accent 1"/>
     <w:lsdException w:unhideWhenUsed="0" w:uiPriority="69" w:semiHidden="0" w:name="Medium Grid 3 Accent 1"/>
     <w:lsdException w:unhideWhenUsed="0" w:uiPriority="70" w:semiHidden="0" w:name="Dark List Accent 1"/>
     <w:lsdException w:unhideWhenUsed="0" w:uiPriority="71" w:semiHidden="0" w:name="Colorful Shading Accent 1"/>
     <w:lsdException w:unhideWhenUsed="0" w:uiPriority="72" w:semiHidden="0" w:name="Colorful List Accent 1"/>
     <w:lsdException w:unhideWhenUsed="0" w:uiPriority="73" w:semiHidden="0" w:name="Colorful Grid Accent 1"/>
-    <w:lsdException w:qFormat="1" w:unhideWhenUsed="0" w:uiPriority="60" w:semiHidden="0" w:name="Light Shading Accent 2"/>
+    <w:lsdException w:unhideWhenUsed="0" w:uiPriority="60" w:semiHidden="0" w:name="Light Shading Accent 2"/>
     <w:lsdException w:unhideWhenUsed="0" w:uiPriority="61" w:semiHidden="0" w:name="Light List Accent 2"/>
-    <w:lsdException w:qFormat="1" w:unhideWhenUsed="0" w:uiPriority="62" w:semiHidden="0" w:name="Light Grid Accent 2"/>
-    <w:lsdException w:qFormat="1" w:unhideWhenUsed="0" w:uiPriority="63" w:semiHidden="0" w:name="Medium Shading 1 Accent 2"/>
+    <w:lsdException w:unhideWhenUsed="0" w:uiPriority="62" w:semiHidden="0" w:name="Light Grid Accent 2"/>
+    <w:lsdException w:unhideWhenUsed="0" w:uiPriority="63" w:semiHidden="0" w:name="Medium Shading 1 Accent 2"/>
     <w:lsdException w:unhideWhenUsed="0" w:uiPriority="64" w:semiHidden="0" w:name="Medium Shading 2 Accent 2"/>
-    <w:lsdException w:qFormat="1" w:unhideWhenUsed="0" w:uiPriority="65" w:semiHidden="0" w:name="Medium List 1 Accent 2"/>
-    <w:lsdException w:qFormat="1" w:unhideWhenUsed="0" w:uiPriority="66" w:semiHidden="0" w:name="Medium List 2 Accent 2"/>
-    <w:lsdException w:qFormat="1" w:unhideWhenUsed="0" w:uiPriority="67" w:semiHidden="0" w:name="Medium Grid 1 Accent 2"/>
+    <w:lsdException w:unhideWhenUsed="0" w:uiPriority="65" w:semiHidden="0" w:name="Medium List 1 Accent 2"/>
+    <w:lsdException w:unhideWhenUsed="0" w:uiPriority="66" w:semiHidden="0" w:name="Medium List 2 Accent 2"/>
+    <w:lsdException w:unhideWhenUsed="0" w:uiPriority="67" w:semiHidden="0" w:name="Medium Grid 1 Accent 2"/>
     <w:lsdException w:unhideWhenUsed="0" w:uiPriority="68" w:semiHidden="0" w:name="Medium Grid 2 Accent 2"/>
     <w:lsdException w:unhideWhenUsed="0" w:uiPriority="69" w:semiHidden="0" w:name="Medium Grid 3 Accent 2"/>
     <w:lsdException w:unhideWhenUsed="0" w:uiPriority="70" w:semiHidden="0" w:name="Dark List Accent 2"/>
     <w:lsdException w:unhideWhenUsed="0" w:uiPriority="71" w:semiHidden="0" w:name="Colorful Shading Accent 2"/>
     <w:lsdException w:unhideWhenUsed="0" w:uiPriority="72" w:semiHidden="0" w:name="Colorful List Accent 2"/>
     <w:lsdException w:unhideWhenUsed="0" w:uiPriority="73" w:semiHidden="0" w:name="Colorful Grid Accent 2"/>
-    <w:lsdException w:qFormat="1" w:unhideWhenUsed="0" w:uiPriority="60" w:semiHidden="0" w:name="Light Shading Accent 3"/>
-    <w:lsdException w:qFormat="1" w:unhideWhenUsed="0" w:uiPriority="61" w:semiHidden="0" w:name="Light List Accent 3"/>
-    <w:lsdException w:qFormat="1" w:unhideWhenUsed="0" w:uiPriority="62" w:semiHidden="0" w:name="Light Grid Accent 3"/>
-    <w:lsdException w:qFormat="1" w:unhideWhenUsed="0" w:uiPriority="63" w:semiHidden="0" w:name="Medium Shading 1 Accent 3"/>
+    <w:lsdException w:unhideWhenUsed="0" w:uiPriority="60" w:semiHidden="0" w:name="Light Shading Accent 3"/>
+    <w:lsdException w:unhideWhenUsed="0" w:uiPriority="61" w:semiHidden="0" w:name="Light List Accent 3"/>
+    <w:lsdException w:unhideWhenUsed="0" w:uiPriority="62" w:semiHidden="0" w:name="Light Grid Accent 3"/>
+    <w:lsdException w:unhideWhenUsed="0" w:uiPriority="63" w:semiHidden="0" w:name="Medium Shading 1 Accent 3"/>
     <w:lsdException w:unhideWhenUsed="0" w:uiPriority="64" w:semiHidden="0" w:name="Medium Shading 2 Accent 3"/>
-    <w:lsdException w:qFormat="1" w:unhideWhenUsed="0" w:uiPriority="65" w:semiHidden="0" w:name="Medium List 1 Accent 3"/>
+    <w:lsdException w:unhideWhenUsed="0" w:uiPriority="65" w:semiHidden="0" w:name="Medium List 1 Accent 3"/>
     <w:lsdException w:unhideWhenUsed="0" w:uiPriority="66" w:semiHidden="0" w:name="Medium List 2 Accent 3"/>
-    <w:lsdException w:qFormat="1" w:unhideWhenUsed="0" w:uiPriority="67" w:semiHidden="0" w:name="Medium Grid 1 Accent 3"/>
+    <w:lsdException w:unhideWhenUsed="0" w:uiPriority="67" w:semiHidden="0" w:name="Medium Grid 1 Accent 3"/>
     <w:lsdException w:unhideWhenUsed="0" w:uiPriority="68" w:semiHidden="0" w:name="Medium Grid 2 Accent 3"/>
     <w:lsdException w:unhideWhenUsed="0" w:uiPriority="69" w:semiHidden="0" w:name="Medium Grid 3 Accent 3"/>
     <w:lsdException w:unhideWhenUsed="0" w:uiPriority="70" w:semiHidden="0" w:name="Dark List Accent 3"/>
@@ -20679,25 +21532,25 @@
     <w:lsdException w:unhideWhenUsed="0" w:uiPriority="72" w:semiHidden="0" w:name="Colorful List Accent 3"/>
     <w:lsdException w:unhideWhenUsed="0" w:uiPriority="73" w:semiHidden="0" w:name="Colorful Grid Accent 3"/>
     <w:lsdException w:unhideWhenUsed="0" w:uiPriority="60" w:semiHidden="0" w:name="Light Shading Accent 4"/>
-    <w:lsdException w:qFormat="1" w:unhideWhenUsed="0" w:uiPriority="61" w:semiHidden="0" w:name="Light List Accent 4"/>
+    <w:lsdException w:unhideWhenUsed="0" w:uiPriority="61" w:semiHidden="0" w:name="Light List Accent 4"/>
     <w:lsdException w:unhideWhenUsed="0" w:uiPriority="62" w:semiHidden="0" w:name="Light Grid Accent 4"/>
     <w:lsdException w:unhideWhenUsed="0" w:uiPriority="63" w:semiHidden="0" w:name="Medium Shading 1 Accent 4"/>
     <w:lsdException w:unhideWhenUsed="0" w:uiPriority="64" w:semiHidden="0" w:name="Medium Shading 2 Accent 4"/>
-    <w:lsdException w:qFormat="1" w:unhideWhenUsed="0" w:uiPriority="65" w:semiHidden="0" w:name="Medium List 1 Accent 4"/>
-    <w:lsdException w:qFormat="1" w:unhideWhenUsed="0" w:uiPriority="66" w:semiHidden="0" w:name="Medium List 2 Accent 4"/>
-    <w:lsdException w:qFormat="1" w:unhideWhenUsed="0" w:uiPriority="67" w:semiHidden="0" w:name="Medium Grid 1 Accent 4"/>
+    <w:lsdException w:unhideWhenUsed="0" w:uiPriority="65" w:semiHidden="0" w:name="Medium List 1 Accent 4"/>
+    <w:lsdException w:unhideWhenUsed="0" w:uiPriority="66" w:semiHidden="0" w:name="Medium List 2 Accent 4"/>
+    <w:lsdException w:unhideWhenUsed="0" w:uiPriority="67" w:semiHidden="0" w:name="Medium Grid 1 Accent 4"/>
     <w:lsdException w:unhideWhenUsed="0" w:uiPriority="68" w:semiHidden="0" w:name="Medium Grid 2 Accent 4"/>
     <w:lsdException w:unhideWhenUsed="0" w:uiPriority="69" w:semiHidden="0" w:name="Medium Grid 3 Accent 4"/>
     <w:lsdException w:unhideWhenUsed="0" w:uiPriority="70" w:semiHidden="0" w:name="Dark List Accent 4"/>
     <w:lsdException w:unhideWhenUsed="0" w:uiPriority="71" w:semiHidden="0" w:name="Colorful Shading Accent 4"/>
     <w:lsdException w:unhideWhenUsed="0" w:uiPriority="72" w:semiHidden="0" w:name="Colorful List Accent 4"/>
     <w:lsdException w:unhideWhenUsed="0" w:uiPriority="73" w:semiHidden="0" w:name="Colorful Grid Accent 4"/>
-    <w:lsdException w:qFormat="1" w:unhideWhenUsed="0" w:uiPriority="60" w:semiHidden="0" w:name="Light Shading Accent 5"/>
-    <w:lsdException w:qFormat="1" w:unhideWhenUsed="0" w:uiPriority="61" w:semiHidden="0" w:name="Light List Accent 5"/>
+    <w:lsdException w:unhideWhenUsed="0" w:uiPriority="60" w:semiHidden="0" w:name="Light Shading Accent 5"/>
+    <w:lsdException w:unhideWhenUsed="0" w:uiPriority="61" w:semiHidden="0" w:name="Light List Accent 5"/>
     <w:lsdException w:unhideWhenUsed="0" w:uiPriority="62" w:semiHidden="0" w:name="Light Grid Accent 5"/>
-    <w:lsdException w:qFormat="1" w:unhideWhenUsed="0" w:uiPriority="63" w:semiHidden="0" w:name="Medium Shading 1 Accent 5"/>
+    <w:lsdException w:unhideWhenUsed="0" w:uiPriority="63" w:semiHidden="0" w:name="Medium Shading 1 Accent 5"/>
     <w:lsdException w:unhideWhenUsed="0" w:uiPriority="64" w:semiHidden="0" w:name="Medium Shading 2 Accent 5"/>
-    <w:lsdException w:qFormat="1" w:unhideWhenUsed="0" w:uiPriority="65" w:semiHidden="0" w:name="Medium List 1 Accent 5"/>
+    <w:lsdException w:unhideWhenUsed="0" w:uiPriority="65" w:semiHidden="0" w:name="Medium List 1 Accent 5"/>
     <w:lsdException w:unhideWhenUsed="0" w:uiPriority="66" w:semiHidden="0" w:name="Medium List 2 Accent 5"/>
     <w:lsdException w:unhideWhenUsed="0" w:uiPriority="67" w:semiHidden="0" w:name="Medium Grid 1 Accent 5"/>
     <w:lsdException w:unhideWhenUsed="0" w:uiPriority="68" w:semiHidden="0" w:name="Medium Grid 2 Accent 5"/>
@@ -20706,14 +21559,14 @@
     <w:lsdException w:unhideWhenUsed="0" w:uiPriority="71" w:semiHidden="0" w:name="Colorful Shading Accent 5"/>
     <w:lsdException w:unhideWhenUsed="0" w:uiPriority="72" w:semiHidden="0" w:name="Colorful List Accent 5"/>
     <w:lsdException w:unhideWhenUsed="0" w:uiPriority="73" w:semiHidden="0" w:name="Colorful Grid Accent 5"/>
-    <w:lsdException w:qFormat="1" w:unhideWhenUsed="0" w:uiPriority="60" w:semiHidden="0" w:name="Light Shading Accent 6"/>
+    <w:lsdException w:unhideWhenUsed="0" w:uiPriority="60" w:semiHidden="0" w:name="Light Shading Accent 6"/>
     <w:lsdException w:unhideWhenUsed="0" w:uiPriority="61" w:semiHidden="0" w:name="Light List Accent 6"/>
-    <w:lsdException w:qFormat="1" w:unhideWhenUsed="0" w:uiPriority="62" w:semiHidden="0" w:name="Light Grid Accent 6"/>
-    <w:lsdException w:qFormat="1" w:unhideWhenUsed="0" w:uiPriority="63" w:semiHidden="0" w:name="Medium Shading 1 Accent 6"/>
-    <w:lsdException w:qFormat="1" w:unhideWhenUsed="0" w:uiPriority="64" w:semiHidden="0" w:name="Medium Shading 2 Accent 6"/>
+    <w:lsdException w:unhideWhenUsed="0" w:uiPriority="62" w:semiHidden="0" w:name="Light Grid Accent 6"/>
+    <w:lsdException w:unhideWhenUsed="0" w:uiPriority="63" w:semiHidden="0" w:name="Medium Shading 1 Accent 6"/>
+    <w:lsdException w:unhideWhenUsed="0" w:uiPriority="64" w:semiHidden="0" w:name="Medium Shading 2 Accent 6"/>
     <w:lsdException w:unhideWhenUsed="0" w:uiPriority="65" w:semiHidden="0" w:name="Medium List 1 Accent 6"/>
     <w:lsdException w:unhideWhenUsed="0" w:uiPriority="66" w:semiHidden="0" w:name="Medium List 2 Accent 6"/>
-    <w:lsdException w:qFormat="1" w:unhideWhenUsed="0" w:uiPriority="67" w:semiHidden="0" w:name="Medium Grid 1 Accent 6"/>
+    <w:lsdException w:unhideWhenUsed="0" w:uiPriority="67" w:semiHidden="0" w:name="Medium Grid 1 Accent 6"/>
     <w:lsdException w:unhideWhenUsed="0" w:uiPriority="68" w:semiHidden="0" w:name="Medium Grid 2 Accent 6"/>
     <w:lsdException w:unhideWhenUsed="0" w:uiPriority="69" w:semiHidden="0" w:name="Medium Grid 3 Accent 6"/>
     <w:lsdException w:unhideWhenUsed="0" w:uiPriority="70" w:semiHidden="0" w:name="Dark List Accent 6"/>
@@ -20972,7 +21825,6 @@
     <w:name w:val="Default Paragraph Font"/>
     <w:semiHidden/>
     <w:unhideWhenUsed/>
-    <w:qFormat/>
     <w:uiPriority w:val="1"/>
   </w:style>
   <w:style w:type="table" w:default="1" w:styleId="35">
@@ -20993,7 +21845,6 @@
     <w:name w:val="macro"/>
     <w:link w:val="150"/>
     <w:unhideWhenUsed/>
-    <w:qFormat/>
     <w:uiPriority w:val="99"/>
     <w:pPr>
       <w:tabs>
@@ -21018,7 +21869,6 @@
     <w:name w:val="List 3"/>
     <w:basedOn w:val="1"/>
     <w:unhideWhenUsed/>
-    <w:qFormat/>
     <w:uiPriority w:val="99"/>
     <w:pPr>
       <w:ind w:left="1080" w:hanging="360"/>
@@ -21103,7 +21953,6 @@
     <w:basedOn w:val="1"/>
     <w:link w:val="149"/>
     <w:unhideWhenUsed/>
-    <w:qFormat/>
     <w:uiPriority w:val="99"/>
     <w:pPr>
       <w:spacing w:after="120"/>
@@ -21117,7 +21966,6 @@
     <w:name w:val="List Bullet 3"/>
     <w:basedOn w:val="1"/>
     <w:unhideWhenUsed/>
-    <w:qFormat/>
     <w:uiPriority w:val="99"/>
     <w:pPr>
       <w:numPr>
@@ -21132,7 +21980,6 @@
     <w:basedOn w:val="1"/>
     <w:link w:val="147"/>
     <w:unhideWhenUsed/>
-    <w:qFormat/>
     <w:uiPriority w:val="99"/>
     <w:pPr>
       <w:spacing w:after="120"/>
@@ -21142,7 +21989,6 @@
     <w:name w:val="List Number 3"/>
     <w:basedOn w:val="1"/>
     <w:unhideWhenUsed/>
-    <w:qFormat/>
     <w:uiPriority w:val="99"/>
     <w:pPr>
       <w:numPr>
@@ -21156,7 +22002,6 @@
     <w:name w:val="List 2"/>
     <w:basedOn w:val="1"/>
     <w:unhideWhenUsed/>
-    <w:qFormat/>
     <w:uiPriority w:val="99"/>
     <w:pPr>
       <w:ind w:left="720" w:hanging="360"/>
@@ -21167,7 +22012,6 @@
     <w:name w:val="List Continue"/>
     <w:basedOn w:val="1"/>
     <w:unhideWhenUsed/>
-    <w:qFormat/>
     <w:uiPriority w:val="99"/>
     <w:pPr>
       <w:spacing w:after="120"/>
@@ -21179,7 +22023,6 @@
     <w:name w:val="List Bullet 2"/>
     <w:basedOn w:val="1"/>
     <w:unhideWhenUsed/>
-    <w:qFormat/>
     <w:uiPriority w:val="99"/>
     <w:pPr>
       <w:numPr>
@@ -21284,7 +22127,6 @@
     <w:basedOn w:val="1"/>
     <w:link w:val="148"/>
     <w:unhideWhenUsed/>
-    <w:qFormat/>
     <w:uiPriority w:val="99"/>
     <w:pPr>
       <w:spacing w:after="120" w:line="480" w:lineRule="auto"/>
@@ -21294,7 +22136,6 @@
     <w:name w:val="List Continue 2"/>
     <w:basedOn w:val="1"/>
     <w:unhideWhenUsed/>
-    <w:qFormat/>
     <w:uiPriority w:val="99"/>
     <w:pPr>
       <w:spacing w:after="120"/>
@@ -21306,7 +22147,6 @@
     <w:name w:val="List Continue 3"/>
     <w:basedOn w:val="1"/>
     <w:unhideWhenUsed/>
-    <w:qFormat/>
     <w:uiPriority w:val="99"/>
     <w:pPr>
       <w:spacing w:after="120"/>
@@ -21367,7 +22207,6 @@
   <w:style w:type="table" w:styleId="37">
     <w:name w:val="Light Shading"/>
     <w:basedOn w:val="35"/>
-    <w:qFormat/>
     <w:uiPriority w:val="60"/>
     <w:pPr>
       <w:spacing w:after="0" w:line="240" w:lineRule="auto"/>
@@ -21566,7 +22405,6 @@
   <w:style w:type="table" w:styleId="39">
     <w:name w:val="Light Shading Accent 2"/>
     <w:basedOn w:val="35"/>
-    <w:qFormat/>
     <w:uiPriority w:val="60"/>
     <w:pPr>
       <w:spacing w:after="0" w:line="240" w:lineRule="auto"/>
@@ -21666,7 +22504,6 @@
   <w:style w:type="table" w:styleId="40">
     <w:name w:val="Light Shading Accent 3"/>
     <w:basedOn w:val="35"/>
-    <w:qFormat/>
     <w:uiPriority w:val="60"/>
     <w:pPr>
       <w:spacing w:after="0" w:line="240" w:lineRule="auto"/>
@@ -21865,7 +22702,6 @@
   <w:style w:type="table" w:styleId="42">
     <w:name w:val="Light Shading Accent 5"/>
     <w:basedOn w:val="35"/>
-    <w:qFormat/>
     <w:uiPriority w:val="60"/>
     <w:pPr>
       <w:spacing w:after="0" w:line="240" w:lineRule="auto"/>
@@ -21965,7 +22801,6 @@
   <w:style w:type="table" w:styleId="43">
     <w:name w:val="Light Shading Accent 6"/>
     <w:basedOn w:val="35"/>
-    <w:qFormat/>
     <w:uiPriority w:val="60"/>
     <w:pPr>
       <w:spacing w:after="0" w:line="240" w:lineRule="auto"/>
@@ -22158,7 +22993,6 @@
   <w:style w:type="table" w:styleId="45">
     <w:name w:val="Light List Accent 1"/>
     <w:basedOn w:val="35"/>
-    <w:qFormat/>
     <w:uiPriority w:val="61"/>
     <w:pPr>
       <w:spacing w:after="0" w:line="240" w:lineRule="auto"/>
@@ -22345,7 +23179,6 @@
   <w:style w:type="table" w:styleId="47">
     <w:name w:val="Light List Accent 3"/>
     <w:basedOn w:val="35"/>
-    <w:qFormat/>
     <w:uiPriority w:val="61"/>
     <w:pPr>
       <w:spacing w:after="0" w:line="240" w:lineRule="auto"/>
@@ -22439,7 +23272,6 @@
   <w:style w:type="table" w:styleId="48">
     <w:name w:val="Light List Accent 4"/>
     <w:basedOn w:val="35"/>
-    <w:qFormat/>
     <w:uiPriority w:val="61"/>
     <w:pPr>
       <w:spacing w:after="0" w:line="240" w:lineRule="auto"/>
@@ -22533,7 +23365,6 @@
   <w:style w:type="table" w:styleId="49">
     <w:name w:val="Light List Accent 5"/>
     <w:basedOn w:val="35"/>
-    <w:qFormat/>
     <w:uiPriority w:val="61"/>
     <w:pPr>
       <w:spacing w:after="0" w:line="240" w:lineRule="auto"/>
@@ -22720,7 +23551,6 @@
   <w:style w:type="table" w:styleId="51">
     <w:name w:val="Light Grid"/>
     <w:basedOn w:val="35"/>
-    <w:qFormat/>
     <w:uiPriority w:val="62"/>
     <w:pPr>
       <w:spacing w:after="0" w:line="240" w:lineRule="auto"/>
@@ -22973,7 +23803,6 @@
   <w:style w:type="table" w:styleId="53">
     <w:name w:val="Light Grid Accent 2"/>
     <w:basedOn w:val="35"/>
-    <w:qFormat/>
     <w:uiPriority w:val="62"/>
     <w:pPr>
       <w:spacing w:after="0" w:line="240" w:lineRule="auto"/>
@@ -23100,7 +23929,6 @@
   <w:style w:type="table" w:styleId="54">
     <w:name w:val="Light Grid Accent 3"/>
     <w:basedOn w:val="35"/>
-    <w:qFormat/>
     <w:uiPriority w:val="62"/>
     <w:pPr>
       <w:spacing w:after="0" w:line="240" w:lineRule="auto"/>
@@ -23479,7 +24307,6 @@
   <w:style w:type="table" w:styleId="57">
     <w:name w:val="Light Grid Accent 6"/>
     <w:basedOn w:val="35"/>
-    <w:qFormat/>
     <w:uiPriority w:val="62"/>
     <w:pPr>
       <w:spacing w:after="0" w:line="240" w:lineRule="auto"/>
@@ -23820,7 +24647,6 @@
   <w:style w:type="table" w:styleId="60">
     <w:name w:val="Medium Shading 1 Accent 2"/>
     <w:basedOn w:val="35"/>
-    <w:qFormat/>
     <w:uiPriority w:val="63"/>
     <w:pPr>
       <w:spacing w:after="0" w:line="240" w:lineRule="auto"/>
@@ -23928,7 +24754,6 @@
   <w:style w:type="table" w:styleId="61">
     <w:name w:val="Medium Shading 1 Accent 3"/>
     <w:basedOn w:val="35"/>
-    <w:qFormat/>
     <w:uiPriority w:val="63"/>
     <w:pPr>
       <w:spacing w:after="0" w:line="240" w:lineRule="auto"/>
@@ -24143,7 +24968,6 @@
   <w:style w:type="table" w:styleId="63">
     <w:name w:val="Medium Shading 1 Accent 5"/>
     <w:basedOn w:val="35"/>
-    <w:qFormat/>
     <w:uiPriority w:val="63"/>
     <w:pPr>
       <w:spacing w:after="0" w:line="240" w:lineRule="auto"/>
@@ -24251,7 +25075,6 @@
   <w:style w:type="table" w:styleId="64">
     <w:name w:val="Medium Shading 1 Accent 6"/>
     <w:basedOn w:val="35"/>
-    <w:qFormat/>
     <w:uiPriority w:val="63"/>
     <w:pPr>
       <w:spacing w:after="0" w:line="240" w:lineRule="auto"/>
@@ -24524,7 +25347,6 @@
   <w:style w:type="table" w:styleId="66">
     <w:name w:val="Medium Shading 2 Accent 1"/>
     <w:basedOn w:val="35"/>
-    <w:qFormat/>
     <w:uiPriority w:val="64"/>
     <w:pPr>
       <w:spacing w:after="0" w:line="240" w:lineRule="auto"/>
@@ -25350,7 +26172,6 @@
   <w:style w:type="table" w:styleId="71">
     <w:name w:val="Medium Shading 2 Accent 6"/>
     <w:basedOn w:val="35"/>
-    <w:qFormat/>
     <w:uiPriority w:val="64"/>
     <w:pPr>
       <w:spacing w:after="0" w:line="240" w:lineRule="auto"/>
@@ -25516,7 +26337,6 @@
   <w:style w:type="table" w:styleId="72">
     <w:name w:val="Medium List 1"/>
     <w:basedOn w:val="35"/>
-    <w:qFormat/>
     <w:uiPriority w:val="65"/>
     <w:pPr>
       <w:spacing w:after="0" w:line="240" w:lineRule="auto"/>
@@ -25697,7 +26517,6 @@
   <w:style w:type="table" w:styleId="74">
     <w:name w:val="Medium List 1 Accent 2"/>
     <w:basedOn w:val="35"/>
-    <w:qFormat/>
     <w:uiPriority w:val="65"/>
     <w:pPr>
       <w:spacing w:after="0" w:line="240" w:lineRule="auto"/>
@@ -25788,7 +26607,6 @@
   <w:style w:type="table" w:styleId="75">
     <w:name w:val="Medium List 1 Accent 3"/>
     <w:basedOn w:val="35"/>
-    <w:qFormat/>
     <w:uiPriority w:val="65"/>
     <w:pPr>
       <w:spacing w:after="0" w:line="240" w:lineRule="auto"/>
@@ -25879,7 +26697,6 @@
   <w:style w:type="table" w:styleId="76">
     <w:name w:val="Medium List 1 Accent 4"/>
     <w:basedOn w:val="35"/>
-    <w:qFormat/>
     <w:uiPriority w:val="65"/>
     <w:pPr>
       <w:spacing w:after="0" w:line="240" w:lineRule="auto"/>
@@ -25970,7 +26787,6 @@
   <w:style w:type="table" w:styleId="77">
     <w:name w:val="Medium List 1 Accent 5"/>
     <w:basedOn w:val="35"/>
-    <w:qFormat/>
     <w:uiPriority w:val="65"/>
     <w:pPr>
       <w:spacing w:after="0" w:line="240" w:lineRule="auto"/>
@@ -26280,7 +27096,6 @@
   <w:style w:type="table" w:styleId="80">
     <w:name w:val="Medium List 2 Accent 1"/>
     <w:basedOn w:val="35"/>
-    <w:qFormat/>
     <w:uiPriority w:val="66"/>
     <w:pPr>
       <w:spacing w:after="0" w:line="240" w:lineRule="auto"/>
@@ -26410,7 +27225,6 @@
   <w:style w:type="table" w:styleId="81">
     <w:name w:val="Medium List 2 Accent 2"/>
     <w:basedOn w:val="35"/>
-    <w:qFormat/>
     <w:uiPriority w:val="66"/>
     <w:pPr>
       <w:spacing w:after="0" w:line="240" w:lineRule="auto"/>
@@ -26669,7 +27483,6 @@
   <w:style w:type="table" w:styleId="83">
     <w:name w:val="Medium List 2 Accent 4"/>
     <w:basedOn w:val="35"/>
-    <w:qFormat/>
     <w:uiPriority w:val="66"/>
     <w:pPr>
       <w:spacing w:after="0" w:line="240" w:lineRule="auto"/>
@@ -27057,7 +27870,6 @@
   <w:style w:type="table" w:styleId="86">
     <w:name w:val="Medium Grid 1"/>
     <w:basedOn w:val="35"/>
-    <w:qFormat/>
     <w:uiPriority w:val="67"/>
     <w:pPr>
       <w:spacing w:after="0" w:line="240" w:lineRule="auto"/>
@@ -27127,7 +27939,6 @@
   <w:style w:type="table" w:styleId="87">
     <w:name w:val="Medium Grid 1 Accent 1"/>
     <w:basedOn w:val="35"/>
-    <w:qFormat/>
     <w:uiPriority w:val="67"/>
     <w:pPr>
       <w:spacing w:after="0" w:line="240" w:lineRule="auto"/>
@@ -27197,7 +28008,6 @@
   <w:style w:type="table" w:styleId="88">
     <w:name w:val="Medium Grid 1 Accent 2"/>
     <w:basedOn w:val="35"/>
-    <w:qFormat/>
     <w:uiPriority w:val="67"/>
     <w:pPr>
       <w:spacing w:after="0" w:line="240" w:lineRule="auto"/>
@@ -27267,7 +28077,6 @@
   <w:style w:type="table" w:styleId="89">
     <w:name w:val="Medium Grid 1 Accent 3"/>
     <w:basedOn w:val="35"/>
-    <w:qFormat/>
     <w:uiPriority w:val="67"/>
     <w:pPr>
       <w:spacing w:after="0" w:line="240" w:lineRule="auto"/>
@@ -27337,7 +28146,6 @@
   <w:style w:type="table" w:styleId="90">
     <w:name w:val="Medium Grid 1 Accent 4"/>
     <w:basedOn w:val="35"/>
-    <w:qFormat/>
     <w:uiPriority w:val="67"/>
     <w:pPr>
       <w:spacing w:after="0" w:line="240" w:lineRule="auto"/>
@@ -27476,7 +28284,6 @@
   <w:style w:type="table" w:styleId="92">
     <w:name w:val="Medium Grid 1 Accent 6"/>
     <w:basedOn w:val="35"/>
-    <w:qFormat/>
     <w:uiPriority w:val="67"/>
     <w:pPr>
       <w:spacing w:after="0" w:line="240" w:lineRule="auto"/>
@@ -32865,7 +33672,6 @@
     <w:name w:val="Heading 2 Char"/>
     <w:basedOn w:val="135"/>
     <w:link w:val="4"/>
-    <w:qFormat/>
     <w:uiPriority w:val="9"/>
     <w:rPr>
       <w:rFonts w:asciiTheme="majorHAnsi" w:hAnsiTheme="majorHAnsi" w:eastAsiaTheme="majorEastAsia" w:cstheme="majorBidi"/>
@@ -32885,7 +33691,6 @@
     <w:name w:val="Heading 3 Char"/>
     <w:basedOn w:val="135"/>
     <w:link w:val="5"/>
-    <w:qFormat/>
     <w:uiPriority w:val="9"/>
     <w:rPr>
       <w:rFonts w:asciiTheme="majorHAnsi" w:hAnsiTheme="majorHAnsi" w:eastAsiaTheme="majorEastAsia" w:cstheme="majorBidi"/>
@@ -32903,7 +33708,6 @@
     <w:name w:val="Title Char"/>
     <w:basedOn w:val="135"/>
     <w:link w:val="34"/>
-    <w:qFormat/>
     <w:uiPriority w:val="10"/>
     <w:rPr>
       <w:rFonts w:asciiTheme="majorHAnsi" w:hAnsiTheme="majorHAnsi" w:eastAsiaTheme="majorEastAsia" w:cstheme="majorBidi"/>
@@ -32918,7 +33722,6 @@
     <w:name w:val="Subtitle Char"/>
     <w:basedOn w:val="135"/>
     <w:link w:val="28"/>
-    <w:qFormat/>
     <w:uiPriority w:val="11"/>
     <w:rPr>
       <w:rFonts w:asciiTheme="majorHAnsi" w:hAnsiTheme="majorHAnsi" w:eastAsiaTheme="majorEastAsia" w:cstheme="majorBidi"/>
@@ -32955,7 +33758,6 @@
     <w:name w:val="Body Text 2 Char"/>
     <w:basedOn w:val="135"/>
     <w:link w:val="31"/>
-    <w:qFormat/>
     <w:uiPriority w:val="99"/>
   </w:style>
   <w:style w:type="character" w:customStyle="1" w:styleId="149">
@@ -33001,7 +33803,6 @@
     <w:name w:val="Quote Char"/>
     <w:basedOn w:val="135"/>
     <w:link w:val="151"/>
-    <w:qFormat/>
     <w:uiPriority w:val="29"/>
     <w:rPr>
       <w:i/>
@@ -33019,7 +33820,6 @@
     <w:basedOn w:val="135"/>
     <w:link w:val="6"/>
     <w:semiHidden/>
-    <w:qFormat/>
     <w:uiPriority w:val="9"/>
     <w:rPr>
       <w:rFonts w:asciiTheme="majorHAnsi" w:hAnsiTheme="majorHAnsi" w:eastAsiaTheme="majorEastAsia" w:cstheme="majorBidi"/>
@@ -33040,7 +33840,6 @@
     <w:basedOn w:val="135"/>
     <w:link w:val="7"/>
     <w:semiHidden/>
-    <w:qFormat/>
     <w:uiPriority w:val="9"/>
     <w:rPr>
       <w:rFonts w:asciiTheme="majorHAnsi" w:hAnsiTheme="majorHAnsi" w:eastAsiaTheme="majorEastAsia" w:cstheme="majorBidi"/>
@@ -33104,7 +33903,6 @@
     <w:basedOn w:val="135"/>
     <w:link w:val="11"/>
     <w:semiHidden/>
-    <w:qFormat/>
     <w:uiPriority w:val="9"/>
     <w:rPr>
       <w:rFonts w:asciiTheme="majorHAnsi" w:hAnsiTheme="majorHAnsi" w:eastAsiaTheme="majorEastAsia" w:cstheme="majorBidi"/>
@@ -33154,7 +33952,6 @@
     <w:name w:val="Intense Quote Char"/>
     <w:basedOn w:val="135"/>
     <w:link w:val="159"/>
-    <w:qFormat/>
     <w:uiPriority w:val="30"/>
     <w:rPr>
       <w:b/>

</xml_diff>